<commit_message>
Place task QR codes beside report sections
</commit_message>
<xml_diff>
--- a/docs/report.docx
+++ b/docs/report.docx
@@ -1070,7 +1070,7 @@
     <w:p>
       <w:pPr>
         <w:pStyle w:val="11"/>
-        <w:spacing w:after="80" w:line="269" w:lineRule="auto"/>
+        <w:spacing w:after="100" w:line="269" w:lineRule="auto"/>
         <w:jc w:val="left"/>
       </w:pPr>
       <w:r>
@@ -1082,6 +1082,126 @@
         <w:t>В рабочем каталоге assets/audio/core_states находятся варианты для восьми основных состояний: спокойствие, тревога, стресс, сон, фокус, грусть, энергия и настрой. Для каждого состояния зарегистрированы три сета. Всего это 24 сета; 22 из них содержат по четыре слышимых слоя. В двух сетах сна pulse отсутствует по замыслу и замещается технической тишиной при переходе.</w:t>
       </w:r>
     </w:p>
+    <w:tbl>
+      <w:tblPr>
+        <w:tblW w:type="auto" w:w="0"/>
+        <w:jc w:val="center"/>
+        <w:tblLayout w:type="fixed"/>
+        <w:tblLook w:firstColumn="1" w:firstRow="1" w:lastColumn="0" w:lastRow="0" w:noHBand="0" w:noVBand="1" w:val="04A0"/>
+        <w:tblBorders>
+          <w:top w:val="single" w:sz="4" w:color="D9D9D9"/>
+          <w:left w:val="single" w:sz="4" w:color="D9D9D9"/>
+          <w:bottom w:val="single" w:sz="4" w:color="D9D9D9"/>
+          <w:right w:val="single" w:sz="4" w:color="D9D9D9"/>
+          <w:insideH w:val="single" w:sz="4" w:color="D9D9D9"/>
+          <w:insideV w:val="single" w:sz="4" w:color="D9D9D9"/>
+        </w:tblBorders>
+      </w:tblPr>
+      <w:tblGrid>
+        <w:gridCol w:w="1701"/>
+        <w:gridCol w:w="7654"/>
+      </w:tblGrid>
+      <w:tr>
+        <w:trPr>
+          <w:trHeight w:val="1389" w:hRule="atLeast"/>
+          <w:cantSplit/>
+        </w:trPr>
+        <w:tc>
+          <w:tcPr>
+            <w:tcW w:type="dxa" w:w="1701"/>
+            <w:vAlign w:val="center"/>
+            <w:tcMar>
+              <w:top w:w="60" w:type="dxa"/>
+              <w:start w:w="100" w:type="dxa"/>
+              <w:bottom w:w="60" w:type="dxa"/>
+              <w:end w:w="100" w:type="dxa"/>
+            </w:tcMar>
+          </w:tcPr>
+          <w:p>
+            <w:pPr>
+              <w:spacing w:after="0"/>
+              <w:jc w:val="center"/>
+            </w:pPr>
+            <w:r>
+              <w:drawing>
+                <wp:inline xmlns:a="http://schemas.openxmlformats.org/drawingml/2006/main" xmlns:pic="http://schemas.openxmlformats.org/drawingml/2006/picture">
+                  <wp:extent cx="810000" cy="810000"/>
+                  <wp:docPr id="4" name="Picture 4"/>
+                  <wp:cNvGraphicFramePr>
+                    <a:graphicFrameLocks noChangeAspect="1"/>
+                  </wp:cNvGraphicFramePr>
+                  <a:graphic>
+                    <a:graphicData uri="http://schemas.openxmlformats.org/drawingml/2006/picture">
+                      <pic:pic>
+                        <pic:nvPicPr>
+                          <pic:cNvPr id="0" name="image.png"/>
+                          <pic:cNvPicPr/>
+                        </pic:nvPicPr>
+                        <pic:blipFill>
+                          <a:blip r:embed="rId10"/>
+                          <a:stretch>
+                            <a:fillRect/>
+                          </a:stretch>
+                        </pic:blipFill>
+                        <pic:spPr>
+                          <a:xfrm>
+                            <a:off x="0" y="0"/>
+                            <a:ext cx="810000" cy="810000"/>
+                          </a:xfrm>
+                          <a:prstGeom prst="rect"/>
+                        </pic:spPr>
+                      </pic:pic>
+                    </a:graphicData>
+                  </a:graphic>
+                </wp:inline>
+              </w:drawing>
+            </w:r>
+          </w:p>
+        </w:tc>
+        <w:tc>
+          <w:tcPr>
+            <w:tcW w:type="dxa" w:w="7654"/>
+            <w:vAlign w:val="center"/>
+            <w:tcMar>
+              <w:top w:w="60" w:type="dxa"/>
+              <w:start w:w="100" w:type="dxa"/>
+              <w:bottom w:w="60" w:type="dxa"/>
+              <w:end w:w="100" w:type="dxa"/>
+            </w:tcMar>
+          </w:tcPr>
+          <w:p>
+            <w:pPr>
+              <w:spacing w:after="60"/>
+            </w:pPr>
+            <w:r>
+              <w:rPr>
+                <w:rFonts w:ascii="Times New Roman" w:hAnsi="Times New Roman"/>
+                <w:b/>
+                <w:color w:val="000000"/>
+                <w:sz w:val="20"/>
+              </w:rPr>
+              <w:t>Материалы задания 1.1</w:t>
+            </w:r>
+          </w:p>
+          <w:p>
+            <w:pPr>
+              <w:spacing w:after="0"/>
+            </w:pPr>
+            <w:hyperlink r:id="rId20">
+              <w:r>
+                <w:rPr>
+                  <w:rFonts w:ascii="Times New Roman" w:hAnsi="Times New Roman"/>
+                  <w:color w:val="38639A"/>
+                  <w:sz w:val="17"/>
+                  <w:u w:val="single"/>
+                </w:rPr>
+                <w:t>evidence/tasks/1.1.md</w:t>
+              </w:r>
+            </w:hyperlink>
+          </w:p>
+        </w:tc>
+      </w:tr>
+    </w:tbl>
     <w:p>
       <w:pPr>
         <w:pStyle w:val="2"/>
@@ -1109,7 +1229,7 @@
     <w:p>
       <w:pPr>
         <w:pStyle w:val="11"/>
-        <w:spacing w:after="80" w:line="269" w:lineRule="auto"/>
+        <w:spacing w:after="100" w:line="269" w:lineRule="auto"/>
         <w:jc w:val="left"/>
       </w:pPr>
       <w:r>
@@ -1121,6 +1241,126 @@
         <w:t>Отдельная рабочая библиотека MUSIC содержит WAV-файлы звуковых слоёв и коротких событий. Для включения в приложение материал распределён по состояниям, ролям и номерам сетов. Звуковые сочетания формируются из отдельных файлов, что позволяет создавать отличающиеся варианты одной сцены.</w:t>
       </w:r>
     </w:p>
+    <w:tbl>
+      <w:tblPr>
+        <w:tblW w:type="auto" w:w="0"/>
+        <w:jc w:val="center"/>
+        <w:tblLayout w:type="fixed"/>
+        <w:tblLook w:firstColumn="1" w:firstRow="1" w:lastColumn="0" w:lastRow="0" w:noHBand="0" w:noVBand="1" w:val="04A0"/>
+        <w:tblBorders>
+          <w:top w:val="single" w:sz="4" w:color="D9D9D9"/>
+          <w:left w:val="single" w:sz="4" w:color="D9D9D9"/>
+          <w:bottom w:val="single" w:sz="4" w:color="D9D9D9"/>
+          <w:right w:val="single" w:sz="4" w:color="D9D9D9"/>
+          <w:insideH w:val="single" w:sz="4" w:color="D9D9D9"/>
+          <w:insideV w:val="single" w:sz="4" w:color="D9D9D9"/>
+        </w:tblBorders>
+      </w:tblPr>
+      <w:tblGrid>
+        <w:gridCol w:w="1701"/>
+        <w:gridCol w:w="7654"/>
+      </w:tblGrid>
+      <w:tr>
+        <w:trPr>
+          <w:trHeight w:val="1389" w:hRule="atLeast"/>
+          <w:cantSplit/>
+        </w:trPr>
+        <w:tc>
+          <w:tcPr>
+            <w:tcW w:type="dxa" w:w="1701"/>
+            <w:vAlign w:val="center"/>
+            <w:tcMar>
+              <w:top w:w="60" w:type="dxa"/>
+              <w:start w:w="100" w:type="dxa"/>
+              <w:bottom w:w="60" w:type="dxa"/>
+              <w:end w:w="100" w:type="dxa"/>
+            </w:tcMar>
+          </w:tcPr>
+          <w:p>
+            <w:pPr>
+              <w:spacing w:after="0"/>
+              <w:jc w:val="center"/>
+            </w:pPr>
+            <w:r>
+              <w:drawing>
+                <wp:inline xmlns:a="http://schemas.openxmlformats.org/drawingml/2006/main" xmlns:pic="http://schemas.openxmlformats.org/drawingml/2006/picture">
+                  <wp:extent cx="810000" cy="810000"/>
+                  <wp:docPr id="5" name="Picture 5"/>
+                  <wp:cNvGraphicFramePr>
+                    <a:graphicFrameLocks noChangeAspect="1"/>
+                  </wp:cNvGraphicFramePr>
+                  <a:graphic>
+                    <a:graphicData uri="http://schemas.openxmlformats.org/drawingml/2006/picture">
+                      <pic:pic>
+                        <pic:nvPicPr>
+                          <pic:cNvPr id="0" name="image.png"/>
+                          <pic:cNvPicPr/>
+                        </pic:nvPicPr>
+                        <pic:blipFill>
+                          <a:blip r:embed="rId11"/>
+                          <a:stretch>
+                            <a:fillRect/>
+                          </a:stretch>
+                        </pic:blipFill>
+                        <pic:spPr>
+                          <a:xfrm>
+                            <a:off x="0" y="0"/>
+                            <a:ext cx="810000" cy="810000"/>
+                          </a:xfrm>
+                          <a:prstGeom prst="rect"/>
+                        </pic:spPr>
+                      </pic:pic>
+                    </a:graphicData>
+                  </a:graphic>
+                </wp:inline>
+              </w:drawing>
+            </w:r>
+          </w:p>
+        </w:tc>
+        <w:tc>
+          <w:tcPr>
+            <w:tcW w:type="dxa" w:w="7654"/>
+            <w:vAlign w:val="center"/>
+            <w:tcMar>
+              <w:top w:w="60" w:type="dxa"/>
+              <w:start w:w="100" w:type="dxa"/>
+              <w:bottom w:w="60" w:type="dxa"/>
+              <w:end w:w="100" w:type="dxa"/>
+            </w:tcMar>
+          </w:tcPr>
+          <w:p>
+            <w:pPr>
+              <w:spacing w:after="60"/>
+            </w:pPr>
+            <w:r>
+              <w:rPr>
+                <w:rFonts w:ascii="Times New Roman" w:hAnsi="Times New Roman"/>
+                <w:b/>
+                <w:color w:val="000000"/>
+                <w:sz w:val="20"/>
+              </w:rPr>
+              <w:t>Материалы задания 1.2</w:t>
+            </w:r>
+          </w:p>
+          <w:p>
+            <w:pPr>
+              <w:spacing w:after="0"/>
+            </w:pPr>
+            <w:hyperlink r:id="rId21">
+              <w:r>
+                <w:rPr>
+                  <w:rFonts w:ascii="Times New Roman" w:hAnsi="Times New Roman"/>
+                  <w:color w:val="38639A"/>
+                  <w:sz w:val="17"/>
+                  <w:u w:val="single"/>
+                </w:rPr>
+                <w:t>evidence/tasks/1.2.md</w:t>
+              </w:r>
+            </w:hyperlink>
+          </w:p>
+        </w:tc>
+      </w:tr>
+    </w:tbl>
     <w:p>
       <w:pPr>
         <w:pStyle w:val="2"/>
@@ -1149,7 +1389,7 @@
       <w:pPr>
         <w:pStyle w:val="11"/>
         <w:keepLines/>
-        <w:spacing w:after="80" w:line="269" w:lineRule="auto"/>
+        <w:spacing w:after="100" w:line="269" w:lineRule="auto"/>
         <w:jc w:val="left"/>
       </w:pPr>
       <w:r>
@@ -1161,6 +1401,126 @@
         <w:t>Автор практики подтверждает, что все аудиоматериалы MindFlow принадлежат ему. Уникальные варианты звуковых сцен подготовлены из его аудиослоёв для генеративной сборки и микширования.</w:t>
       </w:r>
     </w:p>
+    <w:tbl>
+      <w:tblPr>
+        <w:tblW w:type="auto" w:w="0"/>
+        <w:jc w:val="center"/>
+        <w:tblLayout w:type="fixed"/>
+        <w:tblLook w:firstColumn="1" w:firstRow="1" w:lastColumn="0" w:lastRow="0" w:noHBand="0" w:noVBand="1" w:val="04A0"/>
+        <w:tblBorders>
+          <w:top w:val="single" w:sz="4" w:color="D9D9D9"/>
+          <w:left w:val="single" w:sz="4" w:color="D9D9D9"/>
+          <w:bottom w:val="single" w:sz="4" w:color="D9D9D9"/>
+          <w:right w:val="single" w:sz="4" w:color="D9D9D9"/>
+          <w:insideH w:val="single" w:sz="4" w:color="D9D9D9"/>
+          <w:insideV w:val="single" w:sz="4" w:color="D9D9D9"/>
+        </w:tblBorders>
+      </w:tblPr>
+      <w:tblGrid>
+        <w:gridCol w:w="1701"/>
+        <w:gridCol w:w="7654"/>
+      </w:tblGrid>
+      <w:tr>
+        <w:trPr>
+          <w:trHeight w:val="1389" w:hRule="atLeast"/>
+          <w:cantSplit/>
+        </w:trPr>
+        <w:tc>
+          <w:tcPr>
+            <w:tcW w:type="dxa" w:w="1701"/>
+            <w:vAlign w:val="center"/>
+            <w:tcMar>
+              <w:top w:w="60" w:type="dxa"/>
+              <w:start w:w="100" w:type="dxa"/>
+              <w:bottom w:w="60" w:type="dxa"/>
+              <w:end w:w="100" w:type="dxa"/>
+            </w:tcMar>
+          </w:tcPr>
+          <w:p>
+            <w:pPr>
+              <w:spacing w:after="0"/>
+              <w:jc w:val="center"/>
+            </w:pPr>
+            <w:r>
+              <w:drawing>
+                <wp:inline xmlns:a="http://schemas.openxmlformats.org/drawingml/2006/main" xmlns:pic="http://schemas.openxmlformats.org/drawingml/2006/picture">
+                  <wp:extent cx="810000" cy="810000"/>
+                  <wp:docPr id="6" name="Picture 6"/>
+                  <wp:cNvGraphicFramePr>
+                    <a:graphicFrameLocks noChangeAspect="1"/>
+                  </wp:cNvGraphicFramePr>
+                  <a:graphic>
+                    <a:graphicData uri="http://schemas.openxmlformats.org/drawingml/2006/picture">
+                      <pic:pic>
+                        <pic:nvPicPr>
+                          <pic:cNvPr id="0" name="image.png"/>
+                          <pic:cNvPicPr/>
+                        </pic:nvPicPr>
+                        <pic:blipFill>
+                          <a:blip r:embed="rId12"/>
+                          <a:stretch>
+                            <a:fillRect/>
+                          </a:stretch>
+                        </pic:blipFill>
+                        <pic:spPr>
+                          <a:xfrm>
+                            <a:off x="0" y="0"/>
+                            <a:ext cx="810000" cy="810000"/>
+                          </a:xfrm>
+                          <a:prstGeom prst="rect"/>
+                        </pic:spPr>
+                      </pic:pic>
+                    </a:graphicData>
+                  </a:graphic>
+                </wp:inline>
+              </w:drawing>
+            </w:r>
+          </w:p>
+        </w:tc>
+        <w:tc>
+          <w:tcPr>
+            <w:tcW w:type="dxa" w:w="7654"/>
+            <w:vAlign w:val="center"/>
+            <w:tcMar>
+              <w:top w:w="60" w:type="dxa"/>
+              <w:start w:w="100" w:type="dxa"/>
+              <w:bottom w:w="60" w:type="dxa"/>
+              <w:end w:w="100" w:type="dxa"/>
+            </w:tcMar>
+          </w:tcPr>
+          <w:p>
+            <w:pPr>
+              <w:spacing w:after="60"/>
+            </w:pPr>
+            <w:r>
+              <w:rPr>
+                <w:rFonts w:ascii="Times New Roman" w:hAnsi="Times New Roman"/>
+                <w:b/>
+                <w:color w:val="000000"/>
+                <w:sz w:val="20"/>
+              </w:rPr>
+              <w:t>Материалы задания 1.3</w:t>
+            </w:r>
+          </w:p>
+          <w:p>
+            <w:pPr>
+              <w:spacing w:after="0"/>
+            </w:pPr>
+            <w:hyperlink r:id="rId22">
+              <w:r>
+                <w:rPr>
+                  <w:rFonts w:ascii="Times New Roman" w:hAnsi="Times New Roman"/>
+                  <w:color w:val="38639A"/>
+                  <w:sz w:val="17"/>
+                  <w:u w:val="single"/>
+                </w:rPr>
+                <w:t>evidence/tasks/1.3.md</w:t>
+              </w:r>
+            </w:hyperlink>
+          </w:p>
+        </w:tc>
+      </w:tr>
+    </w:tbl>
     <w:p>
       <w:pPr>
         <w:pStyle w:val="1"/>
@@ -1197,7 +1557,7 @@
     <w:p>
       <w:pPr>
         <w:pStyle w:val="11"/>
-        <w:spacing w:after="80" w:line="269" w:lineRule="auto"/>
+        <w:spacing w:after="100" w:line="269" w:lineRule="auto"/>
         <w:jc w:val="left"/>
       </w:pPr>
       <w:r>
@@ -1209,6 +1569,126 @@
         <w:t>Модуль SoundscapeEngine рассчитывает уровни drone, pad, texture и pulse, а также параметры фильтра, реверберации и задержки с учётом выбранной сцены. Нативная команда updateMix применяет эти значения к аудиографу. Так пользователь получает изменение характера звуковой сцены без прерывания воспроизведения.</w:t>
       </w:r>
     </w:p>
+    <w:tbl>
+      <w:tblPr>
+        <w:tblW w:type="auto" w:w="0"/>
+        <w:jc w:val="center"/>
+        <w:tblLayout w:type="fixed"/>
+        <w:tblLook w:firstColumn="1" w:firstRow="1" w:lastColumn="0" w:lastRow="0" w:noHBand="0" w:noVBand="1" w:val="04A0"/>
+        <w:tblBorders>
+          <w:top w:val="single" w:sz="4" w:color="D9D9D9"/>
+          <w:left w:val="single" w:sz="4" w:color="D9D9D9"/>
+          <w:bottom w:val="single" w:sz="4" w:color="D9D9D9"/>
+          <w:right w:val="single" w:sz="4" w:color="D9D9D9"/>
+          <w:insideH w:val="single" w:sz="4" w:color="D9D9D9"/>
+          <w:insideV w:val="single" w:sz="4" w:color="D9D9D9"/>
+        </w:tblBorders>
+      </w:tblPr>
+      <w:tblGrid>
+        <w:gridCol w:w="1701"/>
+        <w:gridCol w:w="7654"/>
+      </w:tblGrid>
+      <w:tr>
+        <w:trPr>
+          <w:trHeight w:val="1389" w:hRule="atLeast"/>
+          <w:cantSplit/>
+        </w:trPr>
+        <w:tc>
+          <w:tcPr>
+            <w:tcW w:type="dxa" w:w="1701"/>
+            <w:vAlign w:val="center"/>
+            <w:tcMar>
+              <w:top w:w="60" w:type="dxa"/>
+              <w:start w:w="100" w:type="dxa"/>
+              <w:bottom w:w="60" w:type="dxa"/>
+              <w:end w:w="100" w:type="dxa"/>
+            </w:tcMar>
+          </w:tcPr>
+          <w:p>
+            <w:pPr>
+              <w:spacing w:after="0"/>
+              <w:jc w:val="center"/>
+            </w:pPr>
+            <w:r>
+              <w:drawing>
+                <wp:inline xmlns:a="http://schemas.openxmlformats.org/drawingml/2006/main" xmlns:pic="http://schemas.openxmlformats.org/drawingml/2006/picture">
+                  <wp:extent cx="810000" cy="810000"/>
+                  <wp:docPr id="7" name="Picture 7"/>
+                  <wp:cNvGraphicFramePr>
+                    <a:graphicFrameLocks noChangeAspect="1"/>
+                  </wp:cNvGraphicFramePr>
+                  <a:graphic>
+                    <a:graphicData uri="http://schemas.openxmlformats.org/drawingml/2006/picture">
+                      <pic:pic>
+                        <pic:nvPicPr>
+                          <pic:cNvPr id="0" name="image.png"/>
+                          <pic:cNvPicPr/>
+                        </pic:nvPicPr>
+                        <pic:blipFill>
+                          <a:blip r:embed="rId13"/>
+                          <a:stretch>
+                            <a:fillRect/>
+                          </a:stretch>
+                        </pic:blipFill>
+                        <pic:spPr>
+                          <a:xfrm>
+                            <a:off x="0" y="0"/>
+                            <a:ext cx="810000" cy="810000"/>
+                          </a:xfrm>
+                          <a:prstGeom prst="rect"/>
+                        </pic:spPr>
+                      </pic:pic>
+                    </a:graphicData>
+                  </a:graphic>
+                </wp:inline>
+              </w:drawing>
+            </w:r>
+          </w:p>
+        </w:tc>
+        <w:tc>
+          <w:tcPr>
+            <w:tcW w:type="dxa" w:w="7654"/>
+            <w:vAlign w:val="center"/>
+            <w:tcMar>
+              <w:top w:w="60" w:type="dxa"/>
+              <w:start w:w="100" w:type="dxa"/>
+              <w:bottom w:w="60" w:type="dxa"/>
+              <w:end w:w="100" w:type="dxa"/>
+            </w:tcMar>
+          </w:tcPr>
+          <w:p>
+            <w:pPr>
+              <w:spacing w:after="60"/>
+            </w:pPr>
+            <w:r>
+              <w:rPr>
+                <w:rFonts w:ascii="Times New Roman" w:hAnsi="Times New Roman"/>
+                <w:b/>
+                <w:color w:val="000000"/>
+                <w:sz w:val="20"/>
+              </w:rPr>
+              <w:t>Материалы задания 2.1</w:t>
+            </w:r>
+          </w:p>
+          <w:p>
+            <w:pPr>
+              <w:spacing w:after="0"/>
+            </w:pPr>
+            <w:hyperlink r:id="rId23">
+              <w:r>
+                <w:rPr>
+                  <w:rFonts w:ascii="Times New Roman" w:hAnsi="Times New Roman"/>
+                  <w:color w:val="38639A"/>
+                  <w:sz w:val="17"/>
+                  <w:u w:val="single"/>
+                </w:rPr>
+                <w:t>evidence/tasks/2.1.md</w:t>
+              </w:r>
+            </w:hyperlink>
+          </w:p>
+        </w:tc>
+      </w:tr>
+    </w:tbl>
     <w:p>
       <w:pPr>
         <w:pStyle w:val="2"/>
@@ -1218,6 +1698,141 @@
         <w:t>Задание 2.2. Синхронизация циклов и переходы</w:t>
       </w:r>
     </w:p>
+    <w:p>
+      <w:pPr>
+        <w:pStyle w:val="11"/>
+        <w:spacing w:after="100" w:line="269" w:lineRule="auto"/>
+        <w:jc w:val="left"/>
+      </w:pPr>
+      <w:r>
+        <w:rPr>
+          <w:rFonts w:ascii="Times New Roman" w:hAnsi="Times New Roman"/>
+          <w:b w:val="0"/>
+          <w:sz w:val="24"/>
+        </w:rPr>
+        <w:t>При строгой загрузке движок проверяет частоту 48 кГц, стереоформат и равное число кадров слышимых ролей одного сета. Планировщик готовит переходы по общей покадровой сетке и выбирает момент, когда входящий слой сможет прозвучать хотя бы один полный цикл до завершения сессии. Переход, который не помещается в оставшееся время, не запускается.</w:t>
+      </w:r>
+    </w:p>
+    <w:tbl>
+      <w:tblPr>
+        <w:tblW w:type="auto" w:w="0"/>
+        <w:jc w:val="center"/>
+        <w:tblLayout w:type="fixed"/>
+        <w:tblLook w:firstColumn="1" w:firstRow="1" w:lastColumn="0" w:lastRow="0" w:noHBand="0" w:noVBand="1" w:val="04A0"/>
+        <w:tblBorders>
+          <w:top w:val="single" w:sz="4" w:color="D9D9D9"/>
+          <w:left w:val="single" w:sz="4" w:color="D9D9D9"/>
+          <w:bottom w:val="single" w:sz="4" w:color="D9D9D9"/>
+          <w:right w:val="single" w:sz="4" w:color="D9D9D9"/>
+          <w:insideH w:val="single" w:sz="4" w:color="D9D9D9"/>
+          <w:insideV w:val="single" w:sz="4" w:color="D9D9D9"/>
+        </w:tblBorders>
+      </w:tblPr>
+      <w:tblGrid>
+        <w:gridCol w:w="1701"/>
+        <w:gridCol w:w="7654"/>
+      </w:tblGrid>
+      <w:tr>
+        <w:trPr>
+          <w:trHeight w:val="1389" w:hRule="atLeast"/>
+          <w:cantSplit/>
+        </w:trPr>
+        <w:tc>
+          <w:tcPr>
+            <w:tcW w:type="dxa" w:w="1701"/>
+            <w:vAlign w:val="center"/>
+            <w:tcMar>
+              <w:top w:w="60" w:type="dxa"/>
+              <w:start w:w="100" w:type="dxa"/>
+              <w:bottom w:w="60" w:type="dxa"/>
+              <w:end w:w="100" w:type="dxa"/>
+            </w:tcMar>
+          </w:tcPr>
+          <w:p>
+            <w:pPr>
+              <w:spacing w:after="0"/>
+              <w:jc w:val="center"/>
+            </w:pPr>
+            <w:r>
+              <w:drawing>
+                <wp:inline xmlns:a="http://schemas.openxmlformats.org/drawingml/2006/main" xmlns:pic="http://schemas.openxmlformats.org/drawingml/2006/picture">
+                  <wp:extent cx="810000" cy="810000"/>
+                  <wp:docPr id="8" name="Picture 8"/>
+                  <wp:cNvGraphicFramePr>
+                    <a:graphicFrameLocks noChangeAspect="1"/>
+                  </wp:cNvGraphicFramePr>
+                  <a:graphic>
+                    <a:graphicData uri="http://schemas.openxmlformats.org/drawingml/2006/picture">
+                      <pic:pic>
+                        <pic:nvPicPr>
+                          <pic:cNvPr id="0" name="image.png"/>
+                          <pic:cNvPicPr/>
+                        </pic:nvPicPr>
+                        <pic:blipFill>
+                          <a:blip r:embed="rId14"/>
+                          <a:stretch>
+                            <a:fillRect/>
+                          </a:stretch>
+                        </pic:blipFill>
+                        <pic:spPr>
+                          <a:xfrm>
+                            <a:off x="0" y="0"/>
+                            <a:ext cx="810000" cy="810000"/>
+                          </a:xfrm>
+                          <a:prstGeom prst="rect"/>
+                        </pic:spPr>
+                      </pic:pic>
+                    </a:graphicData>
+                  </a:graphic>
+                </wp:inline>
+              </w:drawing>
+            </w:r>
+          </w:p>
+        </w:tc>
+        <w:tc>
+          <w:tcPr>
+            <w:tcW w:type="dxa" w:w="7654"/>
+            <w:vAlign w:val="center"/>
+            <w:tcMar>
+              <w:top w:w="60" w:type="dxa"/>
+              <w:start w:w="100" w:type="dxa"/>
+              <w:bottom w:w="60" w:type="dxa"/>
+              <w:end w:w="100" w:type="dxa"/>
+            </w:tcMar>
+          </w:tcPr>
+          <w:p>
+            <w:pPr>
+              <w:spacing w:after="60"/>
+            </w:pPr>
+            <w:r>
+              <w:rPr>
+                <w:rFonts w:ascii="Times New Roman" w:hAnsi="Times New Roman"/>
+                <w:b/>
+                <w:color w:val="000000"/>
+                <w:sz w:val="20"/>
+              </w:rPr>
+              <w:t>Материалы задания 2.2</w:t>
+            </w:r>
+          </w:p>
+          <w:p>
+            <w:pPr>
+              <w:spacing w:after="0"/>
+            </w:pPr>
+            <w:hyperlink r:id="rId24">
+              <w:r>
+                <w:rPr>
+                  <w:rFonts w:ascii="Times New Roman" w:hAnsi="Times New Roman"/>
+                  <w:color w:val="38639A"/>
+                  <w:sz w:val="17"/>
+                  <w:u w:val="single"/>
+                </w:rPr>
+                <w:t>evidence/tasks/2.2.md</w:t>
+              </w:r>
+            </w:hyperlink>
+          </w:p>
+        </w:tc>
+      </w:tr>
+    </w:tbl>
     <w:p>
       <w:pPr>
         <w:pStyle w:val="11"/>
@@ -1230,7 +1845,25 @@
           <w:b w:val="0"/>
           <w:sz w:val="24"/>
         </w:rPr>
-        <w:t>При строгой загрузке движок проверяет частоту 48 кГц, стереоформат и равное число кадров слышимых ролей одного сета. Планировщик готовит переходы по общей покадровой сетке и выбирает момент, когда входящий слой сможет прозвучать хотя бы один полный цикл до завершения сессии. Переход, который не помещается в оставшееся время, не запускается.</w:t>
+        <w:t>Переход между вариантами звучания выполняется кроссфейдом: громкость исходного слоя уменьшается, а нового увеличивается. Длительность автоматического перехода ограничена диапазоном от двух до четырёх минут и длиной первого цикла входящего файла. На нативной стороне предусмотрены проверки несовместимых циклов и защита от наложения переходов одной роли.</w:t>
+      </w:r>
+    </w:p>
+    <w:p>
+      <w:pPr>
+        <w:pStyle w:val="1"/>
+        <w:keepNext/>
+      </w:pPr>
+      <w:r>
+        <w:t>III. Формат «Мой микс»</w:t>
+      </w:r>
+    </w:p>
+    <w:p>
+      <w:pPr>
+        <w:pStyle w:val="2"/>
+        <w:keepNext/>
+      </w:pPr>
+      <w:r>
+        <w:t>Задание 3.1. Выбор состояния и фона</w:t>
       </w:r>
     </w:p>
     <w:p>
@@ -1245,25 +1878,151 @@
           <w:b w:val="0"/>
           <w:sz w:val="24"/>
         </w:rPr>
-        <w:t>Переход между вариантами звучания выполняется кроссфейдом: громкость исходного слоя уменьшается, а нового увеличивается. Длительность автоматического перехода ограничена диапазоном от двух до четырёх минут и длиной первого цикла входящего файла. На нативной стороне предусмотрены проверки несовместимых циклов и защита от наложения переходов одной роли.</w:t>
-      </w:r>
-    </w:p>
-    <w:p>
-      <w:pPr>
-        <w:pStyle w:val="1"/>
-        <w:keepNext/>
-      </w:pPr>
-      <w:r>
-        <w:t>III. Формат «Мой микс»</w:t>
-      </w:r>
-    </w:p>
+        <w:t>Формат «Мой микс» в интерфейсе приложения назван «Свой микс». Пользователь проходит три шага: вводный экран, выбор одного из восьми состояний и настройку фонового окружения. В каталоге доступны восемь фоновых профилей; на последнем шаге можно изменить соотношение основного состояния и фона двумя регуляторами.</w:t>
+      </w:r>
+    </w:p>
+    <w:p>
+      <w:pPr>
+        <w:pStyle w:val="11"/>
+        <w:spacing w:after="100" w:line="269" w:lineRule="auto"/>
+        <w:jc w:val="left"/>
+      </w:pPr>
+      <w:r>
+        <w:rPr>
+          <w:rFonts w:ascii="Times New Roman" w:hAnsi="Times New Roman"/>
+          <w:b w:val="0"/>
+          <w:sz w:val="24"/>
+        </w:rPr>
+        <w:t>Экран выбора связан с общим маршрутом сессии: выбранные состояние, звуковая сцена и фон передаются в SessionScreen. Это позволяет сформировать собственный вариант звучания из подготовленных ресурсов без отдельного готового файла для каждой комбинации.</w:t>
+      </w:r>
+    </w:p>
+    <w:tbl>
+      <w:tblPr>
+        <w:tblW w:type="auto" w:w="0"/>
+        <w:jc w:val="center"/>
+        <w:tblLayout w:type="fixed"/>
+        <w:tblLook w:firstColumn="1" w:firstRow="1" w:lastColumn="0" w:lastRow="0" w:noHBand="0" w:noVBand="1" w:val="04A0"/>
+        <w:tblBorders>
+          <w:top w:val="single" w:sz="4" w:color="D9D9D9"/>
+          <w:left w:val="single" w:sz="4" w:color="D9D9D9"/>
+          <w:bottom w:val="single" w:sz="4" w:color="D9D9D9"/>
+          <w:right w:val="single" w:sz="4" w:color="D9D9D9"/>
+          <w:insideH w:val="single" w:sz="4" w:color="D9D9D9"/>
+          <w:insideV w:val="single" w:sz="4" w:color="D9D9D9"/>
+        </w:tblBorders>
+      </w:tblPr>
+      <w:tblGrid>
+        <w:gridCol w:w="1701"/>
+        <w:gridCol w:w="7654"/>
+      </w:tblGrid>
+      <w:tr>
+        <w:trPr>
+          <w:trHeight w:val="1389" w:hRule="atLeast"/>
+          <w:cantSplit/>
+        </w:trPr>
+        <w:tc>
+          <w:tcPr>
+            <w:tcW w:type="dxa" w:w="1701"/>
+            <w:vAlign w:val="center"/>
+            <w:tcMar>
+              <w:top w:w="60" w:type="dxa"/>
+              <w:start w:w="100" w:type="dxa"/>
+              <w:bottom w:w="60" w:type="dxa"/>
+              <w:end w:w="100" w:type="dxa"/>
+            </w:tcMar>
+          </w:tcPr>
+          <w:p>
+            <w:pPr>
+              <w:spacing w:after="0"/>
+              <w:jc w:val="center"/>
+            </w:pPr>
+            <w:r>
+              <w:drawing>
+                <wp:inline xmlns:a="http://schemas.openxmlformats.org/drawingml/2006/main" xmlns:pic="http://schemas.openxmlformats.org/drawingml/2006/picture">
+                  <wp:extent cx="810000" cy="810000"/>
+                  <wp:docPr id="9" name="Picture 9"/>
+                  <wp:cNvGraphicFramePr>
+                    <a:graphicFrameLocks noChangeAspect="1"/>
+                  </wp:cNvGraphicFramePr>
+                  <a:graphic>
+                    <a:graphicData uri="http://schemas.openxmlformats.org/drawingml/2006/picture">
+                      <pic:pic>
+                        <pic:nvPicPr>
+                          <pic:cNvPr id="0" name="image.png"/>
+                          <pic:cNvPicPr/>
+                        </pic:nvPicPr>
+                        <pic:blipFill>
+                          <a:blip r:embed="rId15"/>
+                          <a:stretch>
+                            <a:fillRect/>
+                          </a:stretch>
+                        </pic:blipFill>
+                        <pic:spPr>
+                          <a:xfrm>
+                            <a:off x="0" y="0"/>
+                            <a:ext cx="810000" cy="810000"/>
+                          </a:xfrm>
+                          <a:prstGeom prst="rect"/>
+                        </pic:spPr>
+                      </pic:pic>
+                    </a:graphicData>
+                  </a:graphic>
+                </wp:inline>
+              </w:drawing>
+            </w:r>
+          </w:p>
+        </w:tc>
+        <w:tc>
+          <w:tcPr>
+            <w:tcW w:type="dxa" w:w="7654"/>
+            <w:vAlign w:val="center"/>
+            <w:tcMar>
+              <w:top w:w="60" w:type="dxa"/>
+              <w:start w:w="100" w:type="dxa"/>
+              <w:bottom w:w="60" w:type="dxa"/>
+              <w:end w:w="100" w:type="dxa"/>
+            </w:tcMar>
+          </w:tcPr>
+          <w:p>
+            <w:pPr>
+              <w:spacing w:after="60"/>
+            </w:pPr>
+            <w:r>
+              <w:rPr>
+                <w:rFonts w:ascii="Times New Roman" w:hAnsi="Times New Roman"/>
+                <w:b/>
+                <w:color w:val="000000"/>
+                <w:sz w:val="20"/>
+              </w:rPr>
+              <w:t>Материалы задания 3.1</w:t>
+            </w:r>
+          </w:p>
+          <w:p>
+            <w:pPr>
+              <w:spacing w:after="0"/>
+            </w:pPr>
+            <w:hyperlink r:id="rId25">
+              <w:r>
+                <w:rPr>
+                  <w:rFonts w:ascii="Times New Roman" w:hAnsi="Times New Roman"/>
+                  <w:color w:val="38639A"/>
+                  <w:sz w:val="17"/>
+                  <w:u w:val="single"/>
+                </w:rPr>
+                <w:t>evidence/tasks/3.1.md</w:t>
+              </w:r>
+            </w:hyperlink>
+          </w:p>
+        </w:tc>
+      </w:tr>
+    </w:tbl>
     <w:p>
       <w:pPr>
         <w:pStyle w:val="2"/>
         <w:keepNext/>
       </w:pPr>
       <w:r>
-        <w:t>Задание 3.1. Выбор состояния и фона</w:t>
+        <w:t>Задание 3.2. Применение пользовательского баланса</w:t>
       </w:r>
     </w:p>
     <w:p>
@@ -1278,9 +2037,288 @@
           <w:b w:val="0"/>
           <w:sz w:val="24"/>
         </w:rPr>
-        <w:t>Формат «Мой микс» в интерфейсе приложения назван «Свой микс». Пользователь проходит три шага: вводный экран, выбор одного из восьми состояний и настройку фонового окружения. В каталоге доступны восемь фоновых профилей; на последнем шаге можно изменить соотношение основного состояния и фона двумя регуляторами.</w:t>
-      </w:r>
-    </w:p>
+        <w:t>Объект SessionMixConfig хранит идентификатор фона и два уровня громкости. При построении аудиоплана фоновый профиль заменяет одну из ролей исходного сета, а остальные роли сохраняют базовую структуру сцены. Настройки изменяют уровни состояния и фона; допустимый уровень фона ограничивается его профилем.</w:t>
+      </w:r>
+    </w:p>
+    <w:p>
+      <w:pPr>
+        <w:pStyle w:val="11"/>
+        <w:spacing w:after="100" w:line="269" w:lineRule="auto"/>
+        <w:jc w:val="left"/>
+      </w:pPr>
+      <w:r>
+        <w:rPr>
+          <w:rFonts w:ascii="Times New Roman" w:hAnsi="Times New Roman"/>
+          <w:b w:val="0"/>
+          <w:sz w:val="24"/>
+        </w:rPr>
+        <w:t>Для профилей заданы совместимость со сценами и технические параметры, включая роль заменяемого слоя. Поэтому приложение может применять один и тот же пользовательский маршрут к разным состояниям, учитывая ограничения конкретного окружения.</w:t>
+      </w:r>
+    </w:p>
+    <w:tbl>
+      <w:tblPr>
+        <w:tblW w:type="auto" w:w="0"/>
+        <w:jc w:val="center"/>
+        <w:tblLayout w:type="fixed"/>
+        <w:tblLook w:firstColumn="1" w:firstRow="1" w:lastColumn="0" w:lastRow="0" w:noHBand="0" w:noVBand="1" w:val="04A0"/>
+        <w:tblBorders>
+          <w:top w:val="single" w:sz="4" w:color="D9D9D9"/>
+          <w:left w:val="single" w:sz="4" w:color="D9D9D9"/>
+          <w:bottom w:val="single" w:sz="4" w:color="D9D9D9"/>
+          <w:right w:val="single" w:sz="4" w:color="D9D9D9"/>
+          <w:insideH w:val="single" w:sz="4" w:color="D9D9D9"/>
+          <w:insideV w:val="single" w:sz="4" w:color="D9D9D9"/>
+        </w:tblBorders>
+      </w:tblPr>
+      <w:tblGrid>
+        <w:gridCol w:w="1701"/>
+        <w:gridCol w:w="7654"/>
+      </w:tblGrid>
+      <w:tr>
+        <w:trPr>
+          <w:trHeight w:val="1389" w:hRule="atLeast"/>
+          <w:cantSplit/>
+        </w:trPr>
+        <w:tc>
+          <w:tcPr>
+            <w:tcW w:type="dxa" w:w="1701"/>
+            <w:vAlign w:val="center"/>
+            <w:tcMar>
+              <w:top w:w="60" w:type="dxa"/>
+              <w:start w:w="100" w:type="dxa"/>
+              <w:bottom w:w="60" w:type="dxa"/>
+              <w:end w:w="100" w:type="dxa"/>
+            </w:tcMar>
+          </w:tcPr>
+          <w:p>
+            <w:pPr>
+              <w:spacing w:after="0"/>
+              <w:jc w:val="center"/>
+            </w:pPr>
+            <w:r>
+              <w:drawing>
+                <wp:inline xmlns:a="http://schemas.openxmlformats.org/drawingml/2006/main" xmlns:pic="http://schemas.openxmlformats.org/drawingml/2006/picture">
+                  <wp:extent cx="810000" cy="810000"/>
+                  <wp:docPr id="10" name="Picture 10"/>
+                  <wp:cNvGraphicFramePr>
+                    <a:graphicFrameLocks noChangeAspect="1"/>
+                  </wp:cNvGraphicFramePr>
+                  <a:graphic>
+                    <a:graphicData uri="http://schemas.openxmlformats.org/drawingml/2006/picture">
+                      <pic:pic>
+                        <pic:nvPicPr>
+                          <pic:cNvPr id="0" name="image.png"/>
+                          <pic:cNvPicPr/>
+                        </pic:nvPicPr>
+                        <pic:blipFill>
+                          <a:blip r:embed="rId16"/>
+                          <a:stretch>
+                            <a:fillRect/>
+                          </a:stretch>
+                        </pic:blipFill>
+                        <pic:spPr>
+                          <a:xfrm>
+                            <a:off x="0" y="0"/>
+                            <a:ext cx="810000" cy="810000"/>
+                          </a:xfrm>
+                          <a:prstGeom prst="rect"/>
+                        </pic:spPr>
+                      </pic:pic>
+                    </a:graphicData>
+                  </a:graphic>
+                </wp:inline>
+              </w:drawing>
+            </w:r>
+          </w:p>
+        </w:tc>
+        <w:tc>
+          <w:tcPr>
+            <w:tcW w:type="dxa" w:w="7654"/>
+            <w:vAlign w:val="center"/>
+            <w:tcMar>
+              <w:top w:w="60" w:type="dxa"/>
+              <w:start w:w="100" w:type="dxa"/>
+              <w:bottom w:w="60" w:type="dxa"/>
+              <w:end w:w="100" w:type="dxa"/>
+            </w:tcMar>
+          </w:tcPr>
+          <w:p>
+            <w:pPr>
+              <w:spacing w:after="60"/>
+            </w:pPr>
+            <w:r>
+              <w:rPr>
+                <w:rFonts w:ascii="Times New Roman" w:hAnsi="Times New Roman"/>
+                <w:b/>
+                <w:color w:val="000000"/>
+                <w:sz w:val="20"/>
+              </w:rPr>
+              <w:t>Материалы задания 3.2</w:t>
+            </w:r>
+          </w:p>
+          <w:p>
+            <w:pPr>
+              <w:spacing w:after="0"/>
+            </w:pPr>
+            <w:hyperlink r:id="rId26">
+              <w:r>
+                <w:rPr>
+                  <w:rFonts w:ascii="Times New Roman" w:hAnsi="Times New Roman"/>
+                  <w:color w:val="38639A"/>
+                  <w:sz w:val="17"/>
+                  <w:u w:val="single"/>
+                </w:rPr>
+                <w:t>evidence/tasks/3.2.md</w:t>
+              </w:r>
+            </w:hyperlink>
+          </w:p>
+        </w:tc>
+      </w:tr>
+    </w:tbl>
+    <w:p>
+      <w:pPr>
+        <w:pStyle w:val="2"/>
+        <w:keepNext/>
+      </w:pPr>
+      <w:r>
+        <w:t>Задание 3.3. Прослушивание и повторный запуск</w:t>
+      </w:r>
+    </w:p>
+    <w:p>
+      <w:pPr>
+        <w:pStyle w:val="11"/>
+        <w:spacing w:after="100" w:line="269" w:lineRule="auto"/>
+        <w:jc w:val="left"/>
+      </w:pPr>
+      <w:r>
+        <w:rPr>
+          <w:rFonts w:ascii="Times New Roman" w:hAnsi="Times New Roman"/>
+          <w:b w:val="0"/>
+          <w:sz w:val="24"/>
+        </w:rPr>
+        <w:t>Перед запуском сеанса пользователь может прослушать выбранное сочетание в течение 12 секунд. Предпрослушивание загружает начальные слои сформированного аудиоплана и плавно повышает громкость после запуска. После подтверждения выбранные параметры передаются в полноценную сессию.</w:t>
+      </w:r>
+    </w:p>
+    <w:tbl>
+      <w:tblPr>
+        <w:tblW w:type="auto" w:w="0"/>
+        <w:jc w:val="center"/>
+        <w:tblLayout w:type="fixed"/>
+        <w:tblLook w:firstColumn="1" w:firstRow="1" w:lastColumn="0" w:lastRow="0" w:noHBand="0" w:noVBand="1" w:val="04A0"/>
+        <w:tblBorders>
+          <w:top w:val="single" w:sz="4" w:color="D9D9D9"/>
+          <w:left w:val="single" w:sz="4" w:color="D9D9D9"/>
+          <w:bottom w:val="single" w:sz="4" w:color="D9D9D9"/>
+          <w:right w:val="single" w:sz="4" w:color="D9D9D9"/>
+          <w:insideH w:val="single" w:sz="4" w:color="D9D9D9"/>
+          <w:insideV w:val="single" w:sz="4" w:color="D9D9D9"/>
+        </w:tblBorders>
+      </w:tblPr>
+      <w:tblGrid>
+        <w:gridCol w:w="1701"/>
+        <w:gridCol w:w="7654"/>
+      </w:tblGrid>
+      <w:tr>
+        <w:trPr>
+          <w:trHeight w:val="1389" w:hRule="atLeast"/>
+          <w:cantSplit/>
+        </w:trPr>
+        <w:tc>
+          <w:tcPr>
+            <w:tcW w:type="dxa" w:w="1701"/>
+            <w:vAlign w:val="center"/>
+            <w:tcMar>
+              <w:top w:w="60" w:type="dxa"/>
+              <w:start w:w="100" w:type="dxa"/>
+              <w:bottom w:w="60" w:type="dxa"/>
+              <w:end w:w="100" w:type="dxa"/>
+            </w:tcMar>
+          </w:tcPr>
+          <w:p>
+            <w:pPr>
+              <w:spacing w:after="0"/>
+              <w:jc w:val="center"/>
+            </w:pPr>
+            <w:r>
+              <w:drawing>
+                <wp:inline xmlns:a="http://schemas.openxmlformats.org/drawingml/2006/main" xmlns:pic="http://schemas.openxmlformats.org/drawingml/2006/picture">
+                  <wp:extent cx="810000" cy="810000"/>
+                  <wp:docPr id="11" name="Picture 11"/>
+                  <wp:cNvGraphicFramePr>
+                    <a:graphicFrameLocks noChangeAspect="1"/>
+                  </wp:cNvGraphicFramePr>
+                  <a:graphic>
+                    <a:graphicData uri="http://schemas.openxmlformats.org/drawingml/2006/picture">
+                      <pic:pic>
+                        <pic:nvPicPr>
+                          <pic:cNvPr id="0" name="image.png"/>
+                          <pic:cNvPicPr/>
+                        </pic:nvPicPr>
+                        <pic:blipFill>
+                          <a:blip r:embed="rId17"/>
+                          <a:stretch>
+                            <a:fillRect/>
+                          </a:stretch>
+                        </pic:blipFill>
+                        <pic:spPr>
+                          <a:xfrm>
+                            <a:off x="0" y="0"/>
+                            <a:ext cx="810000" cy="810000"/>
+                          </a:xfrm>
+                          <a:prstGeom prst="rect"/>
+                        </pic:spPr>
+                      </pic:pic>
+                    </a:graphicData>
+                  </a:graphic>
+                </wp:inline>
+              </w:drawing>
+            </w:r>
+          </w:p>
+        </w:tc>
+        <w:tc>
+          <w:tcPr>
+            <w:tcW w:type="dxa" w:w="7654"/>
+            <w:vAlign w:val="center"/>
+            <w:tcMar>
+              <w:top w:w="60" w:type="dxa"/>
+              <w:start w:w="100" w:type="dxa"/>
+              <w:bottom w:w="60" w:type="dxa"/>
+              <w:end w:w="100" w:type="dxa"/>
+            </w:tcMar>
+          </w:tcPr>
+          <w:p>
+            <w:pPr>
+              <w:spacing w:after="60"/>
+            </w:pPr>
+            <w:r>
+              <w:rPr>
+                <w:rFonts w:ascii="Times New Roman" w:hAnsi="Times New Roman"/>
+                <w:b/>
+                <w:color w:val="000000"/>
+                <w:sz w:val="20"/>
+              </w:rPr>
+              <w:t>Материалы задания 3.3</w:t>
+            </w:r>
+          </w:p>
+          <w:p>
+            <w:pPr>
+              <w:spacing w:after="0"/>
+            </w:pPr>
+            <w:hyperlink r:id="rId27">
+              <w:r>
+                <w:rPr>
+                  <w:rFonts w:ascii="Times New Roman" w:hAnsi="Times New Roman"/>
+                  <w:color w:val="38639A"/>
+                  <w:sz w:val="17"/>
+                  <w:u w:val="single"/>
+                </w:rPr>
+                <w:t>evidence/tasks/3.3.md</w:t>
+              </w:r>
+            </w:hyperlink>
+          </w:p>
+        </w:tc>
+      </w:tr>
+    </w:tbl>
     <w:p>
       <w:pPr>
         <w:pStyle w:val="11"/>
@@ -1293,7 +2331,16 @@
           <w:b w:val="0"/>
           <w:sz w:val="24"/>
         </w:rPr>
-        <w:t>Экран выбора связан с общим маршрутом сессии: выбранные состояние, звуковая сцена и фон передаются в SessionScreen. Это позволяет сформировать собственный вариант звучания из подготовленных ресурсов без отдельного готового файла для каждой комбинации.</w:t>
+        <w:t>Из экрана сессии микс можно сохранить в избранное вместе с состоянием, фоном, длительностью и уровнями. Экран избранного восстанавливает эти параметры при повторном запуске. Это завершает пользовательский путь от подбора звучания до его повторного использования.</w:t>
+      </w:r>
+    </w:p>
+    <w:p>
+      <w:pPr>
+        <w:pStyle w:val="1"/>
+        <w:keepNext/>
+      </w:pPr>
+      <w:r>
+        <w:t>IV. Формат «Сценарии»</w:t>
       </w:r>
     </w:p>
     <w:p>
@@ -1302,7 +2349,7 @@
         <w:keepNext/>
       </w:pPr>
       <w:r>
-        <w:t>Задание 3.2. Применение пользовательского баланса</w:t>
+        <w:t>Задание 4.1. Каталог и план этапов</w:t>
       </w:r>
     </w:p>
     <w:p>
@@ -1317,7 +2364,151 @@
           <w:b w:val="0"/>
           <w:sz w:val="24"/>
         </w:rPr>
-        <w:t>Объект SessionMixConfig хранит идентификатор фона и два уровня громкости. При построении аудиоплана фоновый профиль заменяет одну из ролей исходного сета, а остальные роли сохраняют базовую структуру сцены. Настройки изменяют уровни состояния и фона; допустимый уровень фона ограничивается его профилем.</w:t>
+        <w:t>В проекте описаны 12 многоэтапных сценариев, распределённых по четырём категориям: утро, фокус, восстановление и сон. Каждый этап содержит состояние, сцену, фоновое окружение и длительность. Экран формата показывает каталог с фильтрами, карточку выбранного сценария и последовательность этапов перед началом сеанса.</w:t>
+      </w:r>
+    </w:p>
+    <w:p>
+      <w:pPr>
+        <w:pStyle w:val="11"/>
+        <w:spacing w:after="100" w:line="269" w:lineRule="auto"/>
+        <w:jc w:val="left"/>
+      </w:pPr>
+      <w:r>
+        <w:rPr>
+          <w:rFonts w:ascii="Times New Roman" w:hAnsi="Times New Roman"/>
+          <w:b w:val="0"/>
+          <w:sz w:val="24"/>
+        </w:rPr>
+        <w:t>Сценарий опирается на существующие аудиосеты состояний: отдельные аудиофайлы для каждого сценария не требуются. Последовательность этапов определяет, какое состояние и окружение будут активны в соответствующий промежуток времени.</w:t>
+      </w:r>
+    </w:p>
+    <w:tbl>
+      <w:tblPr>
+        <w:tblW w:type="auto" w:w="0"/>
+        <w:jc w:val="center"/>
+        <w:tblLayout w:type="fixed"/>
+        <w:tblLook w:firstColumn="1" w:firstRow="1" w:lastColumn="0" w:lastRow="0" w:noHBand="0" w:noVBand="1" w:val="04A0"/>
+        <w:tblBorders>
+          <w:top w:val="single" w:sz="4" w:color="D9D9D9"/>
+          <w:left w:val="single" w:sz="4" w:color="D9D9D9"/>
+          <w:bottom w:val="single" w:sz="4" w:color="D9D9D9"/>
+          <w:right w:val="single" w:sz="4" w:color="D9D9D9"/>
+          <w:insideH w:val="single" w:sz="4" w:color="D9D9D9"/>
+          <w:insideV w:val="single" w:sz="4" w:color="D9D9D9"/>
+        </w:tblBorders>
+      </w:tblPr>
+      <w:tblGrid>
+        <w:gridCol w:w="1701"/>
+        <w:gridCol w:w="7654"/>
+      </w:tblGrid>
+      <w:tr>
+        <w:trPr>
+          <w:trHeight w:val="1389" w:hRule="atLeast"/>
+          <w:cantSplit/>
+        </w:trPr>
+        <w:tc>
+          <w:tcPr>
+            <w:tcW w:type="dxa" w:w="1701"/>
+            <w:vAlign w:val="center"/>
+            <w:tcMar>
+              <w:top w:w="60" w:type="dxa"/>
+              <w:start w:w="100" w:type="dxa"/>
+              <w:bottom w:w="60" w:type="dxa"/>
+              <w:end w:w="100" w:type="dxa"/>
+            </w:tcMar>
+          </w:tcPr>
+          <w:p>
+            <w:pPr>
+              <w:spacing w:after="0"/>
+              <w:jc w:val="center"/>
+            </w:pPr>
+            <w:r>
+              <w:drawing>
+                <wp:inline xmlns:a="http://schemas.openxmlformats.org/drawingml/2006/main" xmlns:pic="http://schemas.openxmlformats.org/drawingml/2006/picture">
+                  <wp:extent cx="810000" cy="810000"/>
+                  <wp:docPr id="12" name="Picture 12"/>
+                  <wp:cNvGraphicFramePr>
+                    <a:graphicFrameLocks noChangeAspect="1"/>
+                  </wp:cNvGraphicFramePr>
+                  <a:graphic>
+                    <a:graphicData uri="http://schemas.openxmlformats.org/drawingml/2006/picture">
+                      <pic:pic>
+                        <pic:nvPicPr>
+                          <pic:cNvPr id="0" name="image.png"/>
+                          <pic:cNvPicPr/>
+                        </pic:nvPicPr>
+                        <pic:blipFill>
+                          <a:blip r:embed="rId18"/>
+                          <a:stretch>
+                            <a:fillRect/>
+                          </a:stretch>
+                        </pic:blipFill>
+                        <pic:spPr>
+                          <a:xfrm>
+                            <a:off x="0" y="0"/>
+                            <a:ext cx="810000" cy="810000"/>
+                          </a:xfrm>
+                          <a:prstGeom prst="rect"/>
+                        </pic:spPr>
+                      </pic:pic>
+                    </a:graphicData>
+                  </a:graphic>
+                </wp:inline>
+              </w:drawing>
+            </w:r>
+          </w:p>
+        </w:tc>
+        <w:tc>
+          <w:tcPr>
+            <w:tcW w:type="dxa" w:w="7654"/>
+            <w:vAlign w:val="center"/>
+            <w:tcMar>
+              <w:top w:w="60" w:type="dxa"/>
+              <w:start w:w="100" w:type="dxa"/>
+              <w:bottom w:w="60" w:type="dxa"/>
+              <w:end w:w="100" w:type="dxa"/>
+            </w:tcMar>
+          </w:tcPr>
+          <w:p>
+            <w:pPr>
+              <w:spacing w:after="60"/>
+            </w:pPr>
+            <w:r>
+              <w:rPr>
+                <w:rFonts w:ascii="Times New Roman" w:hAnsi="Times New Roman"/>
+                <w:b/>
+                <w:color w:val="000000"/>
+                <w:sz w:val="20"/>
+              </w:rPr>
+              <w:t>Материалы задания 4.1</w:t>
+            </w:r>
+          </w:p>
+          <w:p>
+            <w:pPr>
+              <w:spacing w:after="0"/>
+            </w:pPr>
+            <w:hyperlink r:id="rId28">
+              <w:r>
+                <w:rPr>
+                  <w:rFonts w:ascii="Times New Roman" w:hAnsi="Times New Roman"/>
+                  <w:color w:val="38639A"/>
+                  <w:sz w:val="17"/>
+                  <w:u w:val="single"/>
+                </w:rPr>
+                <w:t>evidence/tasks/4.1.md</w:t>
+              </w:r>
+            </w:hyperlink>
+          </w:p>
+        </w:tc>
+      </w:tr>
+    </w:tbl>
+    <w:p>
+      <w:pPr>
+        <w:pStyle w:val="2"/>
+        <w:keepNext/>
+      </w:pPr>
+      <w:r>
+        <w:t>Задание 4.2. Управление переходами между этапами</w:t>
       </w:r>
     </w:p>
     <w:p>
@@ -1332,16 +2523,151 @@
           <w:b w:val="0"/>
           <w:sz w:val="24"/>
         </w:rPr>
-        <w:t>Для профилей заданы совместимость со сценами и технические параметры, включая роль заменяемого слоя. Поэтому приложение может применять один и тот же пользовательский маршрут к разным состояниям, учитывая ограничения конкретного окружения.</w:t>
-      </w:r>
-    </w:p>
-    <w:p>
-      <w:pPr>
-        <w:pStyle w:val="2"/>
+        <w:t>При включённых автоматических переходах в сессию передаётся полное определение сценария. ScenarioRuntimeController хранит текущий этап, время и общий прогресс, обрабатывает паузу и завершение. SessionManager отслеживает окончание этапа, а SessionRunner меняет сцену и звуковой микс, загружает нужные слои и выполняет плавный переход.</w:t>
+      </w:r>
+    </w:p>
+    <w:p>
+      <w:pPr>
+        <w:pStyle w:val="11"/>
+        <w:spacing w:after="100" w:line="269" w:lineRule="auto"/>
+        <w:jc w:val="left"/>
+      </w:pPr>
+      <w:r>
+        <w:rPr>
+          <w:rFonts w:ascii="Times New Roman" w:hAnsi="Times New Roman"/>
+          <w:b w:val="0"/>
+          <w:sz w:val="24"/>
+        </w:rPr>
+        <w:t>Если автоматические переходы выключены, запуск начинается с первого этапа без последовательного прохождения всего сценария. Такой режим позволяет использовать отдельную часть сценария как самостоятельную сессию.</w:t>
+      </w:r>
+    </w:p>
+    <w:tbl>
+      <w:tblPr>
+        <w:tblW w:type="auto" w:w="0"/>
+        <w:jc w:val="center"/>
+        <w:tblLayout w:type="fixed"/>
+        <w:tblLook w:firstColumn="1" w:firstRow="1" w:lastColumn="0" w:lastRow="0" w:noHBand="0" w:noVBand="1" w:val="04A0"/>
+        <w:tblBorders>
+          <w:top w:val="single" w:sz="4" w:color="D9D9D9"/>
+          <w:left w:val="single" w:sz="4" w:color="D9D9D9"/>
+          <w:bottom w:val="single" w:sz="4" w:color="D9D9D9"/>
+          <w:right w:val="single" w:sz="4" w:color="D9D9D9"/>
+          <w:insideH w:val="single" w:sz="4" w:color="D9D9D9"/>
+          <w:insideV w:val="single" w:sz="4" w:color="D9D9D9"/>
+        </w:tblBorders>
+      </w:tblPr>
+      <w:tblGrid>
+        <w:gridCol w:w="1701"/>
+        <w:gridCol w:w="7654"/>
+      </w:tblGrid>
+      <w:tr>
+        <w:trPr>
+          <w:trHeight w:val="1389" w:hRule="atLeast"/>
+          <w:cantSplit/>
+        </w:trPr>
+        <w:tc>
+          <w:tcPr>
+            <w:tcW w:type="dxa" w:w="1701"/>
+            <w:vAlign w:val="center"/>
+            <w:tcMar>
+              <w:top w:w="60" w:type="dxa"/>
+              <w:start w:w="100" w:type="dxa"/>
+              <w:bottom w:w="60" w:type="dxa"/>
+              <w:end w:w="100" w:type="dxa"/>
+            </w:tcMar>
+          </w:tcPr>
+          <w:p>
+            <w:pPr>
+              <w:spacing w:after="0"/>
+              <w:jc w:val="center"/>
+            </w:pPr>
+            <w:r>
+              <w:drawing>
+                <wp:inline xmlns:a="http://schemas.openxmlformats.org/drawingml/2006/main" xmlns:pic="http://schemas.openxmlformats.org/drawingml/2006/picture">
+                  <wp:extent cx="810000" cy="810000"/>
+                  <wp:docPr id="13" name="Picture 13"/>
+                  <wp:cNvGraphicFramePr>
+                    <a:graphicFrameLocks noChangeAspect="1"/>
+                  </wp:cNvGraphicFramePr>
+                  <a:graphic>
+                    <a:graphicData uri="http://schemas.openxmlformats.org/drawingml/2006/picture">
+                      <pic:pic>
+                        <pic:nvPicPr>
+                          <pic:cNvPr id="0" name="image.png"/>
+                          <pic:cNvPicPr/>
+                        </pic:nvPicPr>
+                        <pic:blipFill>
+                          <a:blip r:embed="rId19"/>
+                          <a:stretch>
+                            <a:fillRect/>
+                          </a:stretch>
+                        </pic:blipFill>
+                        <pic:spPr>
+                          <a:xfrm>
+                            <a:off x="0" y="0"/>
+                            <a:ext cx="810000" cy="810000"/>
+                          </a:xfrm>
+                          <a:prstGeom prst="rect"/>
+                        </pic:spPr>
+                      </pic:pic>
+                    </a:graphicData>
+                  </a:graphic>
+                </wp:inline>
+              </w:drawing>
+            </w:r>
+          </w:p>
+        </w:tc>
+        <w:tc>
+          <w:tcPr>
+            <w:tcW w:type="dxa" w:w="7654"/>
+            <w:vAlign w:val="center"/>
+            <w:tcMar>
+              <w:top w:w="60" w:type="dxa"/>
+              <w:start w:w="100" w:type="dxa"/>
+              <w:bottom w:w="60" w:type="dxa"/>
+              <w:end w:w="100" w:type="dxa"/>
+            </w:tcMar>
+          </w:tcPr>
+          <w:p>
+            <w:pPr>
+              <w:spacing w:after="60"/>
+            </w:pPr>
+            <w:r>
+              <w:rPr>
+                <w:rFonts w:ascii="Times New Roman" w:hAnsi="Times New Roman"/>
+                <w:b/>
+                <w:color w:val="000000"/>
+                <w:sz w:val="20"/>
+              </w:rPr>
+              <w:t>Материалы задания 4.2</w:t>
+            </w:r>
+          </w:p>
+          <w:p>
+            <w:pPr>
+              <w:spacing w:after="0"/>
+            </w:pPr>
+            <w:hyperlink r:id="rId29">
+              <w:r>
+                <w:rPr>
+                  <w:rFonts w:ascii="Times New Roman" w:hAnsi="Times New Roman"/>
+                  <w:color w:val="38639A"/>
+                  <w:sz w:val="17"/>
+                  <w:u w:val="single"/>
+                </w:rPr>
+                <w:t>evidence/tasks/4.2.md</w:t>
+              </w:r>
+            </w:hyperlink>
+          </w:p>
+        </w:tc>
+      </w:tr>
+    </w:tbl>
+    <w:p>
+      <w:pPr>
+        <w:pStyle w:val="1"/>
         <w:keepNext/>
       </w:pPr>
       <w:r>
-        <w:t>Задание 3.3. Прослушивание и повторный запуск</w:t>
+        <w:t>V. Проверка результата и выводы</w:t>
       </w:r>
     </w:p>
     <w:p>
@@ -1356,12 +2682,14 @@
           <w:b w:val="0"/>
           <w:sz w:val="24"/>
         </w:rPr>
-        <w:t>Перед запуском сеанса пользователь может прослушать выбранное сочетание в течение 12 секунд. Предпрослушивание загружает начальные слои сформированного аудиоплана и плавно повышает громкость после запуска. После подтверждения выбранные параметры передаются в полноценную сессию.</w:t>
+        <w:t>В проекте присутствуют автоматические тесты конфигурации аудио, планировщика переходов, пользовательского микса и сценарного контроллера. Анализ аудиоресурсов подтверждает наличие 24 сетов для восьми основных состояний и согласованность параметров активных слоёв внутри каждого сета. При этом некоторые сеты состояния «Грусть» различаются по длительности между собой, поэтому для каждого сета используется своя временная сетка.</w:t>
       </w:r>
     </w:p>
     <w:p>
       <w:pPr>
         <w:pStyle w:val="11"/>
+        <w:keepNext/>
+        <w:keepLines/>
         <w:spacing w:after="80" w:line="269" w:lineRule="auto"/>
         <w:jc w:val="left"/>
       </w:pPr>
@@ -1371,282 +2699,12 @@
           <w:b w:val="0"/>
           <w:sz w:val="24"/>
         </w:rPr>
-        <w:t>Из экрана сессии микс можно сохранить в избранное вместе с состоянием, фоном, длительностью и уровнями. Экран избранного восстанавливает эти параметры при повторном запуске. Это завершает пользовательский путь от подбора звучания до его повторного использования.</w:t>
-      </w:r>
-    </w:p>
-    <w:p>
-      <w:pPr>
-        <w:pStyle w:val="1"/>
-        <w:keepNext/>
-      </w:pPr>
-      <w:r>
-        <w:t>IV. Формат «Сценарии»</w:t>
-      </w:r>
-    </w:p>
-    <w:p>
-      <w:pPr>
-        <w:pStyle w:val="2"/>
-        <w:keepNext/>
-      </w:pPr>
-      <w:r>
-        <w:t>Задание 4.1. Каталог и план этапов</w:t>
-      </w:r>
-    </w:p>
-    <w:p>
-      <w:pPr>
-        <w:pStyle w:val="11"/>
-        <w:spacing w:after="80" w:line="269" w:lineRule="auto"/>
-        <w:jc w:val="left"/>
-      </w:pPr>
-      <w:r>
-        <w:rPr>
-          <w:rFonts w:ascii="Times New Roman" w:hAnsi="Times New Roman"/>
-          <w:b w:val="0"/>
-          <w:sz w:val="24"/>
-        </w:rPr>
-        <w:t>В проекте описаны 12 многоэтапных сценариев, распределённых по четырём категориям: утро, фокус, восстановление и сон. Каждый этап содержит состояние, сцену, фоновое окружение и длительность. Экран формата показывает каталог с фильтрами, карточку выбранного сценария и последовательность этапов перед началом сеанса.</w:t>
-      </w:r>
-    </w:p>
-    <w:p>
-      <w:pPr>
-        <w:pStyle w:val="11"/>
-        <w:spacing w:after="80" w:line="269" w:lineRule="auto"/>
-        <w:jc w:val="left"/>
-      </w:pPr>
-      <w:r>
-        <w:rPr>
-          <w:rFonts w:ascii="Times New Roman" w:hAnsi="Times New Roman"/>
-          <w:b w:val="0"/>
-          <w:sz w:val="24"/>
-        </w:rPr>
-        <w:t>Сценарий опирается на существующие аудиосеты состояний: отдельные аудиофайлы для каждого сценария не требуются. Последовательность этапов определяет, какое состояние и окружение будут активны в соответствующий промежуток времени.</w:t>
-      </w:r>
-    </w:p>
-    <w:p>
-      <w:pPr>
-        <w:pStyle w:val="2"/>
-        <w:keepNext/>
-      </w:pPr>
-      <w:r>
-        <w:t>Задание 4.2. Управление переходами между этапами</w:t>
-      </w:r>
-    </w:p>
-    <w:p>
-      <w:pPr>
-        <w:pStyle w:val="11"/>
-        <w:spacing w:after="80" w:line="269" w:lineRule="auto"/>
-        <w:jc w:val="left"/>
-      </w:pPr>
-      <w:r>
-        <w:rPr>
-          <w:rFonts w:ascii="Times New Roman" w:hAnsi="Times New Roman"/>
-          <w:b w:val="0"/>
-          <w:sz w:val="24"/>
-        </w:rPr>
-        <w:t>При включённых автоматических переходах в сессию передаётся полное определение сценария. ScenarioRuntimeController хранит текущий этап, время и общий прогресс, обрабатывает паузу и завершение. SessionManager отслеживает окончание этапа, а SessionRunner меняет сцену и звуковой микс, загружает нужные слои и выполняет плавный переход.</w:t>
-      </w:r>
-    </w:p>
-    <w:p>
-      <w:pPr>
-        <w:pStyle w:val="11"/>
-        <w:spacing w:after="80" w:line="269" w:lineRule="auto"/>
-        <w:jc w:val="left"/>
-      </w:pPr>
-      <w:r>
-        <w:rPr>
-          <w:rFonts w:ascii="Times New Roman" w:hAnsi="Times New Roman"/>
-          <w:b w:val="0"/>
-          <w:sz w:val="24"/>
-        </w:rPr>
-        <w:t>Если автоматические переходы выключены, запуск начинается с первого этапа без последовательного прохождения всего сценария. Такой режим позволяет использовать отдельную часть сценария как самостоятельную сессию.</w:t>
-      </w:r>
-    </w:p>
-    <w:p>
-      <w:pPr>
-        <w:pStyle w:val="1"/>
-        <w:keepNext/>
-      </w:pPr>
-      <w:r>
-        <w:t>V. Проверка результата и выводы</w:t>
-      </w:r>
-    </w:p>
-    <w:p>
-      <w:pPr>
-        <w:pStyle w:val="11"/>
-        <w:spacing w:after="80" w:line="269" w:lineRule="auto"/>
-        <w:jc w:val="left"/>
-      </w:pPr>
-      <w:r>
-        <w:rPr>
-          <w:rFonts w:ascii="Times New Roman" w:hAnsi="Times New Roman"/>
-          <w:b w:val="0"/>
-          <w:sz w:val="24"/>
-        </w:rPr>
-        <w:t>В проекте присутствуют автоматические тесты конфигурации аудио, планировщика переходов, пользовательского микса и сценарного контроллера. Анализ аудиоресурсов подтверждает наличие 24 сетов для восьми основных состояний и согласованность параметров активных слоёв внутри каждого сета. При этом некоторые сеты состояния «Грусть» различаются по длительности между собой, поэтому для каждого сета используется своя временная сетка.</w:t>
-      </w:r>
-    </w:p>
-    <w:p>
-      <w:pPr>
-        <w:pStyle w:val="11"/>
-        <w:spacing w:after="80" w:line="269" w:lineRule="auto"/>
-        <w:jc w:val="left"/>
-      </w:pPr>
-      <w:r>
-        <w:rPr>
-          <w:rFonts w:ascii="Times New Roman" w:hAnsi="Times New Roman"/>
-          <w:b w:val="0"/>
-          <w:sz w:val="24"/>
-        </w:rPr>
         <w:t>В результате подготовлена библиотека вариантов звуковых слоёв, донастроена логика многослойного микширования и переходов, а также связаны с аудиодвижком два пользовательских формата — «Мой микс» и «Сценарии». Перед выпуском необходимо прослушать сочетания на целевых устройствах.</w:t>
       </w:r>
     </w:p>
     <w:p>
       <w:pPr>
-        <w:pStyle w:val="1"/>
-        <w:keepNext/>
-        <w:pageBreakBefore/>
-      </w:pPr>
-      <w:r>
-        <w:t>Материалы работы</w:t>
-      </w:r>
-    </w:p>
-    <w:p>
-      <w:pPr>
-        <w:pStyle w:val="11"/>
-        <w:spacing w:after="80" w:line="269" w:lineRule="auto"/>
-        <w:jc w:val="left"/>
-      </w:pPr>
-      <w:r>
-        <w:rPr>
-          <w:rFonts w:ascii="Times New Roman" w:hAnsi="Times New Roman"/>
-          <w:b w:val="0"/>
-          <w:sz w:val="24"/>
-        </w:rPr>
-        <w:t>Исходный проект: MindFlow APP.</w:t>
-      </w:r>
-    </w:p>
-    <w:p>
-      <w:pPr>
-        <w:pStyle w:val="11"/>
-        <w:spacing w:after="80" w:line="269" w:lineRule="auto"/>
-        <w:jc w:val="left"/>
-      </w:pPr>
-      <w:r>
-        <w:rPr>
-          <w:rFonts w:ascii="Times New Roman" w:hAnsi="Times New Roman"/>
-          <w:b w:val="0"/>
-          <w:sz w:val="24"/>
-        </w:rPr>
-        <w:t>Аудиоресурсы: assets/audio/core_states и отдельная рабочая библиотека MUSIC.</w:t>
-      </w:r>
-    </w:p>
-    <w:p>
-      <w:pPr>
-        <w:pStyle w:val="11"/>
-        <w:spacing w:after="80" w:line="269" w:lineRule="auto"/>
-        <w:jc w:val="left"/>
-      </w:pPr>
-      <w:r>
-        <w:rPr>
-          <w:rFonts w:ascii="Times New Roman" w:hAnsi="Times New Roman"/>
-          <w:b w:val="0"/>
-          <w:sz w:val="24"/>
-        </w:rPr>
-        <w:t>Конфигурация сетов: lib/shared/audio/soundscape_config.dart.</w:t>
-      </w:r>
-    </w:p>
-    <w:p>
-      <w:pPr>
-        <w:pStyle w:val="11"/>
-        <w:spacing w:after="80" w:line="269" w:lineRule="auto"/>
-        <w:jc w:val="left"/>
-      </w:pPr>
-      <w:r>
-        <w:rPr>
-          <w:rFonts w:ascii="Times New Roman" w:hAnsi="Times New Roman"/>
-          <w:b w:val="0"/>
-          <w:sz w:val="24"/>
-        </w:rPr>
-        <w:t>Логика микширования и переходов: lib/shared/audio/soundscape_engine.dart и lib/shared/audio/runtime_soundscape_arranger.dart.</w:t>
-      </w:r>
-    </w:p>
-    <w:p>
-      <w:pPr>
-        <w:pStyle w:val="11"/>
-        <w:spacing w:after="80" w:line="269" w:lineRule="auto"/>
-        <w:jc w:val="left"/>
-      </w:pPr>
-      <w:r>
-        <w:rPr>
-          <w:rFonts w:ascii="Times New Roman" w:hAnsi="Times New Roman"/>
-          <w:b w:val="0"/>
-          <w:sz w:val="24"/>
-        </w:rPr>
-        <w:t>Нативный аудиодвижок: ios/Runner/AppDelegate.swift и macos/Runner/AppDelegate.swift.</w:t>
-      </w:r>
-    </w:p>
-    <w:p>
-      <w:pPr>
-        <w:pStyle w:val="11"/>
-        <w:spacing w:after="80" w:line="269" w:lineRule="auto"/>
-        <w:jc w:val="left"/>
-      </w:pPr>
-      <w:r>
-        <w:rPr>
-          <w:rFonts w:ascii="Times New Roman" w:hAnsi="Times New Roman"/>
-          <w:b w:val="0"/>
-          <w:sz w:val="24"/>
-        </w:rPr>
-        <w:t>Формат «Мой микс»: lib/features/session_formats/mix/mix_flow_screen.dart и lib/shared/audio/session_mix_config.dart.</w:t>
-      </w:r>
-    </w:p>
-    <w:p>
-      <w:pPr>
-        <w:pStyle w:val="11"/>
-        <w:spacing w:after="80" w:line="269" w:lineRule="auto"/>
-        <w:jc w:val="left"/>
-      </w:pPr>
-      <w:r>
-        <w:rPr>
-          <w:rFonts w:ascii="Times New Roman" w:hAnsi="Times New Roman"/>
-          <w:b w:val="0"/>
-          <w:sz w:val="24"/>
-        </w:rPr>
-        <w:t>Формат «Сценарии»: lib/features/session_formats/scenarios и lib/features/session/logic/session_manager.dart.</w:t>
-      </w:r>
-    </w:p>
-    <w:p>
-      <w:pPr>
-        <w:pStyle w:val="11"/>
-        <w:spacing w:after="80" w:line="269" w:lineRule="auto"/>
-        <w:jc w:val="left"/>
-      </w:pPr>
-      <w:r>
-        <w:rPr>
-          <w:rFonts w:ascii="Times New Roman" w:hAnsi="Times New Roman"/>
-          <w:b w:val="0"/>
-          <w:sz w:val="24"/>
-        </w:rPr>
-        <w:t>Каталог аудиоматериалов и параметры сетов: evidence/audio-catalog.md и evidence/audio-catalog.csv.</w:t>
-      </w:r>
-    </w:p>
-    <w:p>
-      <w:pPr>
-        <w:pStyle w:val="11"/>
-        <w:spacing w:after="80" w:line="269" w:lineRule="auto"/>
-        <w:jc w:val="left"/>
-      </w:pPr>
-      <w:r>
-        <w:rPr>
-          <w:rFonts w:ascii="Times New Roman" w:hAnsi="Times New Roman"/>
-          <w:sz w:val="22"/>
-        </w:rPr>
-        <w:t>Электронное портфолио практики: https://github.com/AndrewCaulaincourt/practice-2026-course-2</w:t>
-      </w:r>
-    </w:p>
-    <w:p>
-      <w:pPr>
-        <w:spacing w:before="160" w:after="200"/>
+        <w:spacing w:before="120" w:after="200"/>
         <w:jc w:val="left"/>
       </w:pPr>
       <w:r>
@@ -1694,7 +2752,19 @@
     </w:p>
     <w:p>
       <w:pPr>
-        <w:spacing w:before="560" w:after="120" w:line="278" w:lineRule="auto"/>
+        <w:pStyle w:val="1"/>
+        <w:keepNext/>
+        <w:pageBreakBefore w:val="0"/>
+      </w:pPr>
+      <w:r>
+        <w:t>Материалы работы</w:t>
+      </w:r>
+    </w:p>
+    <w:p>
+      <w:pPr>
+        <w:pStyle w:val="11"/>
+        <w:spacing w:after="80" w:line="269" w:lineRule="auto"/>
+        <w:jc w:val="left"/>
       </w:pPr>
       <w:r>
         <w:rPr>
@@ -1702,12 +2772,14 @@
           <w:b w:val="0"/>
           <w:sz w:val="24"/>
         </w:rPr>
-        <w:t>Руководитель практики ____________________________</w:t>
-      </w:r>
-    </w:p>
-    <w:p>
-      <w:pPr>
-        <w:spacing w:after="120" w:line="278" w:lineRule="auto"/>
+        <w:t>Исходный проект: MindFlow APP.</w:t>
+      </w:r>
+    </w:p>
+    <w:p>
+      <w:pPr>
+        <w:pStyle w:val="11"/>
+        <w:spacing w:after="80" w:line="269" w:lineRule="auto"/>
+        <w:jc w:val="left"/>
       </w:pPr>
       <w:r>
         <w:rPr>
@@ -1715,915 +2787,139 @@
           <w:b w:val="0"/>
           <w:sz w:val="24"/>
         </w:rPr>
+        <w:t>Аудиоресурсы: assets/audio/core_states и отдельная рабочая библиотека MUSIC.</w:t>
+      </w:r>
+    </w:p>
+    <w:p>
+      <w:pPr>
+        <w:pStyle w:val="11"/>
+        <w:spacing w:after="80" w:line="269" w:lineRule="auto"/>
+        <w:jc w:val="left"/>
+      </w:pPr>
+      <w:r>
+        <w:rPr>
+          <w:rFonts w:ascii="Times New Roman" w:hAnsi="Times New Roman"/>
+          <w:b w:val="0"/>
+          <w:sz w:val="24"/>
+        </w:rPr>
+        <w:t>Конфигурация сетов: lib/shared/audio/soundscape_config.dart.</w:t>
+      </w:r>
+    </w:p>
+    <w:p>
+      <w:pPr>
+        <w:pStyle w:val="11"/>
+        <w:spacing w:after="80" w:line="269" w:lineRule="auto"/>
+        <w:jc w:val="left"/>
+      </w:pPr>
+      <w:r>
+        <w:rPr>
+          <w:rFonts w:ascii="Times New Roman" w:hAnsi="Times New Roman"/>
+          <w:b w:val="0"/>
+          <w:sz w:val="24"/>
+        </w:rPr>
+        <w:t>Логика микширования и переходов: lib/shared/audio/soundscape_engine.dart и lib/shared/audio/runtime_soundscape_arranger.dart.</w:t>
+      </w:r>
+    </w:p>
+    <w:p>
+      <w:pPr>
+        <w:pStyle w:val="11"/>
+        <w:spacing w:after="80" w:line="269" w:lineRule="auto"/>
+        <w:jc w:val="left"/>
+      </w:pPr>
+      <w:r>
+        <w:rPr>
+          <w:rFonts w:ascii="Times New Roman" w:hAnsi="Times New Roman"/>
+          <w:b w:val="0"/>
+          <w:sz w:val="24"/>
+        </w:rPr>
+        <w:t>Нативный аудиодвижок: ios/Runner/AppDelegate.swift и macos/Runner/AppDelegate.swift.</w:t>
+      </w:r>
+    </w:p>
+    <w:p>
+      <w:pPr>
+        <w:pStyle w:val="11"/>
+        <w:spacing w:after="80" w:line="269" w:lineRule="auto"/>
+        <w:jc w:val="left"/>
+      </w:pPr>
+      <w:r>
+        <w:rPr>
+          <w:rFonts w:ascii="Times New Roman" w:hAnsi="Times New Roman"/>
+          <w:b w:val="0"/>
+          <w:sz w:val="24"/>
+        </w:rPr>
+        <w:t>Формат «Мой микс»: lib/features/session_formats/mix/mix_flow_screen.dart и lib/shared/audio/session_mix_config.dart.</w:t>
+      </w:r>
+    </w:p>
+    <w:p>
+      <w:pPr>
+        <w:pStyle w:val="11"/>
+        <w:spacing w:after="80" w:line="269" w:lineRule="auto"/>
+        <w:jc w:val="left"/>
+      </w:pPr>
+      <w:r>
+        <w:rPr>
+          <w:rFonts w:ascii="Times New Roman" w:hAnsi="Times New Roman"/>
+          <w:b w:val="0"/>
+          <w:sz w:val="24"/>
+        </w:rPr>
+        <w:t>Формат «Сценарии»: lib/features/session_formats/scenarios и lib/features/session/logic/session_manager.dart.</w:t>
+      </w:r>
+    </w:p>
+    <w:p>
+      <w:pPr>
+        <w:pStyle w:val="11"/>
+        <w:spacing w:after="80" w:line="269" w:lineRule="auto"/>
+        <w:jc w:val="left"/>
+      </w:pPr>
+      <w:r>
+        <w:rPr>
+          <w:rFonts w:ascii="Times New Roman" w:hAnsi="Times New Roman"/>
+          <w:b w:val="0"/>
+          <w:sz w:val="24"/>
+        </w:rPr>
+        <w:t>Каталог аудиоматериалов и параметры сетов: evidence/audio-catalog.md и evidence/audio-catalog.csv.</w:t>
+      </w:r>
+    </w:p>
+    <w:p>
+      <w:pPr>
+        <w:pStyle w:val="11"/>
+        <w:spacing w:after="80" w:line="269" w:lineRule="auto"/>
+        <w:jc w:val="left"/>
+      </w:pPr>
+      <w:r>
+        <w:rPr>
+          <w:rFonts w:ascii="Times New Roman" w:hAnsi="Times New Roman"/>
+          <w:sz w:val="22"/>
+        </w:rPr>
+        <w:t>Электронное портфолио практики: https://github.com/AndrewCaulaincourt/practice-2026-course-2</w:t>
+      </w:r>
+    </w:p>
+    <w:p>
+      <w:pPr>
+        <w:spacing w:before="560" w:after="120" w:line="278" w:lineRule="auto"/>
+      </w:pPr>
+      <w:r>
+        <w:rPr>
+          <w:rFonts w:ascii="Times New Roman" w:hAnsi="Times New Roman"/>
+          <w:b w:val="0"/>
+          <w:sz w:val="24"/>
+        </w:rPr>
+        <w:t>Руководитель практики ____________________________</w:t>
+      </w:r>
+    </w:p>
+    <w:p>
+      <w:pPr>
+        <w:spacing w:after="120" w:line="278" w:lineRule="auto"/>
+      </w:pPr>
+      <w:r>
+        <w:rPr>
+          <w:rFonts w:ascii="Times New Roman" w:hAnsi="Times New Roman"/>
+          <w:b w:val="0"/>
+          <w:sz w:val="24"/>
+        </w:rPr>
         <w:t>Задание выполнил _____________________</w:t>
       </w:r>
     </w:p>
-    <w:p>
-      <w:r>
-        <w:br w:type="page"/>
-      </w:r>
-    </w:p>
-    <w:p>
-      <w:pPr>
-        <w:spacing w:after="100"/>
-      </w:pPr>
-      <w:r>
-        <w:rPr>
-          <w:rFonts w:ascii="Times New Roman" w:hAnsi="Times New Roman"/>
-          <w:b/>
-          <w:color w:val="000000"/>
-          <w:sz w:val="26"/>
-        </w:rPr>
-        <w:t>Приложение. QR-коды материалов по заданиям</w:t>
-      </w:r>
-    </w:p>
-    <w:p>
-      <w:pPr>
-        <w:spacing w:after="40"/>
-      </w:pPr>
-      <w:r>
-        <w:rPr>
-          <w:rFonts w:ascii="Times New Roman" w:hAnsi="Times New Roman"/>
-          <w:b w:val="0"/>
-          <w:sz w:val="18"/>
-        </w:rPr>
-        <w:t>Каждый QR-код открывает страницу соответствующего задания с результатом и подтверждающими материалами.</w:t>
-      </w:r>
-    </w:p>
-    <w:p>
-      <w:pPr>
-        <w:spacing w:after="140"/>
-      </w:pPr>
-      <w:r>
-        <w:rPr>
-          <w:rFonts w:ascii="Times New Roman" w:hAnsi="Times New Roman"/>
-          <w:b w:val="0"/>
-          <w:color w:val="3C3C3C"/>
-          <w:sz w:val="16"/>
-        </w:rPr>
-        <w:t>https://github.com/AndrewCaulaincourt/practice-2026-course-2</w:t>
-      </w:r>
-    </w:p>
-    <w:tbl>
-      <w:tblPr>
-        <w:tblW w:type="auto" w:w="0"/>
-        <w:jc w:val="center"/>
-        <w:tblLayout w:type="fixed"/>
-        <w:tblLook w:firstColumn="1" w:firstRow="1" w:lastColumn="0" w:lastRow="0" w:noHBand="0" w:noVBand="1" w:val="04A0"/>
-        <w:tblBorders>
-          <w:top w:val="single" w:sz="4" w:color="D9D9D9"/>
-          <w:left w:val="single" w:sz="4" w:color="D9D9D9"/>
-          <w:bottom w:val="single" w:sz="4" w:color="D9D9D9"/>
-          <w:right w:val="single" w:sz="4" w:color="D9D9D9"/>
-          <w:insideH w:val="single" w:sz="4" w:color="D9D9D9"/>
-          <w:insideV w:val="single" w:sz="4" w:color="D9D9D9"/>
-        </w:tblBorders>
-      </w:tblPr>
-      <w:tblGrid>
-        <w:gridCol w:w="4677"/>
-        <w:gridCol w:w="4677"/>
-      </w:tblGrid>
-      <w:tr>
-        <w:trPr>
-          <w:trHeight w:val="2013" w:hRule="atLeast"/>
-          <w:cantSplit/>
-        </w:trPr>
-        <w:tc>
-          <w:tcPr>
-            <w:tcW w:type="dxa" w:w="4677"/>
-            <w:vAlign w:val="center"/>
-            <w:tcMar>
-              <w:top w:w="100" w:type="dxa"/>
-              <w:start w:w="90" w:type="dxa"/>
-              <w:bottom w:w="100" w:type="dxa"/>
-              <w:end w:w="90" w:type="dxa"/>
-            </w:tcMar>
-          </w:tcPr>
-          <w:p>
-            <w:pPr>
-              <w:spacing w:after="0"/>
-              <w:jc w:val="center"/>
-            </w:pPr>
-            <w:r>
-              <w:drawing>
-                <wp:inline xmlns:a="http://schemas.openxmlformats.org/drawingml/2006/main" xmlns:pic="http://schemas.openxmlformats.org/drawingml/2006/picture">
-                  <wp:extent cx="917999" cy="917999"/>
-                  <wp:docPr id="4" name="Picture 4"/>
-                  <wp:cNvGraphicFramePr>
-                    <a:graphicFrameLocks noChangeAspect="1"/>
-                  </wp:cNvGraphicFramePr>
-                  <a:graphic>
-                    <a:graphicData uri="http://schemas.openxmlformats.org/drawingml/2006/picture">
-                      <pic:pic>
-                        <pic:nvPicPr>
-                          <pic:cNvPr id="0" name="task-1.1.png"/>
-                          <pic:cNvPicPr/>
-                        </pic:nvPicPr>
-                        <pic:blipFill>
-                          <a:blip r:embed="rId10"/>
-                          <a:stretch>
-                            <a:fillRect/>
-                          </a:stretch>
-                        </pic:blipFill>
-                        <pic:spPr>
-                          <a:xfrm>
-                            <a:off x="0" y="0"/>
-                            <a:ext cx="917999" cy="917999"/>
-                          </a:xfrm>
-                          <a:prstGeom prst="rect"/>
-                        </pic:spPr>
-                      </pic:pic>
-                    </a:graphicData>
-                  </a:graphic>
-                </wp:inline>
-              </w:drawing>
-            </w:r>
-          </w:p>
-          <w:p>
-            <w:pPr>
-              <w:spacing w:after="0"/>
-              <w:jc w:val="center"/>
-            </w:pPr>
-            <w:r>
-              <w:rPr>
-                <w:rFonts w:ascii="Times New Roman" w:hAnsi="Times New Roman"/>
-                <w:b/>
-                <w:sz w:val="18"/>
-              </w:rPr>
-              <w:t>1.1  Аудиослои и варианты</w:t>
-            </w:r>
-          </w:p>
-          <w:p>
-            <w:pPr>
-              <w:spacing w:after="0"/>
-              <w:jc w:val="center"/>
-            </w:pPr>
-            <w:r>
-              <w:rPr>
-                <w:rFonts w:ascii="Times New Roman" w:hAnsi="Times New Roman"/>
-                <w:b w:val="0"/>
-                <w:color w:val="5A5A5A"/>
-                <w:sz w:val="15"/>
-              </w:rPr>
-              <w:t>evidence/tasks/1.1.md</w:t>
-            </w:r>
-          </w:p>
-        </w:tc>
-        <w:tc>
-          <w:tcPr>
-            <w:tcW w:type="dxa" w:w="4677"/>
-            <w:vAlign w:val="center"/>
-            <w:tcMar>
-              <w:top w:w="100" w:type="dxa"/>
-              <w:start w:w="90" w:type="dxa"/>
-              <w:bottom w:w="100" w:type="dxa"/>
-              <w:end w:w="90" w:type="dxa"/>
-            </w:tcMar>
-          </w:tcPr>
-          <w:p>
-            <w:pPr>
-              <w:spacing w:after="0"/>
-              <w:jc w:val="center"/>
-            </w:pPr>
-            <w:r>
-              <w:drawing>
-                <wp:inline xmlns:a="http://schemas.openxmlformats.org/drawingml/2006/main" xmlns:pic="http://schemas.openxmlformats.org/drawingml/2006/picture">
-                  <wp:extent cx="917999" cy="917999"/>
-                  <wp:docPr id="5" name="Picture 5"/>
-                  <wp:cNvGraphicFramePr>
-                    <a:graphicFrameLocks noChangeAspect="1"/>
-                  </wp:cNvGraphicFramePr>
-                  <a:graphic>
-                    <a:graphicData uri="http://schemas.openxmlformats.org/drawingml/2006/picture">
-                      <pic:pic>
-                        <pic:nvPicPr>
-                          <pic:cNvPr id="0" name="task-1.2.png"/>
-                          <pic:cNvPicPr/>
-                        </pic:nvPicPr>
-                        <pic:blipFill>
-                          <a:blip r:embed="rId11"/>
-                          <a:stretch>
-                            <a:fillRect/>
-                          </a:stretch>
-                        </pic:blipFill>
-                        <pic:spPr>
-                          <a:xfrm>
-                            <a:off x="0" y="0"/>
-                            <a:ext cx="917999" cy="917999"/>
-                          </a:xfrm>
-                          <a:prstGeom prst="rect"/>
-                        </pic:spPr>
-                      </pic:pic>
-                    </a:graphicData>
-                  </a:graphic>
-                </wp:inline>
-              </w:drawing>
-            </w:r>
-          </w:p>
-          <w:p>
-            <w:pPr>
-              <w:spacing w:after="0"/>
-              <w:jc w:val="center"/>
-            </w:pPr>
-            <w:r>
-              <w:rPr>
-                <w:rFonts w:ascii="Times New Roman" w:hAnsi="Times New Roman"/>
-                <w:b/>
-                <w:sz w:val="18"/>
-              </w:rPr>
-              <w:t>1.2  Подготовка слоёв к микшированию</w:t>
-            </w:r>
-          </w:p>
-          <w:p>
-            <w:pPr>
-              <w:spacing w:after="0"/>
-              <w:jc w:val="center"/>
-            </w:pPr>
-            <w:r>
-              <w:rPr>
-                <w:rFonts w:ascii="Times New Roman" w:hAnsi="Times New Roman"/>
-                <w:b w:val="0"/>
-                <w:color w:val="5A5A5A"/>
-                <w:sz w:val="15"/>
-              </w:rPr>
-              <w:t>evidence/tasks/1.2.md</w:t>
-            </w:r>
-          </w:p>
-        </w:tc>
-      </w:tr>
-      <w:tr>
-        <w:trPr>
-          <w:trHeight w:val="2013" w:hRule="atLeast"/>
-          <w:cantSplit/>
-        </w:trPr>
-        <w:tc>
-          <w:tcPr>
-            <w:tcW w:type="dxa" w:w="4677"/>
-            <w:vAlign w:val="center"/>
-            <w:tcMar>
-              <w:top w:w="100" w:type="dxa"/>
-              <w:start w:w="90" w:type="dxa"/>
-              <w:bottom w:w="100" w:type="dxa"/>
-              <w:end w:w="90" w:type="dxa"/>
-            </w:tcMar>
-          </w:tcPr>
-          <w:p>
-            <w:pPr>
-              <w:spacing w:after="0"/>
-              <w:jc w:val="center"/>
-            </w:pPr>
-            <w:r>
-              <w:drawing>
-                <wp:inline xmlns:a="http://schemas.openxmlformats.org/drawingml/2006/main" xmlns:pic="http://schemas.openxmlformats.org/drawingml/2006/picture">
-                  <wp:extent cx="917999" cy="917999"/>
-                  <wp:docPr id="6" name="Picture 6"/>
-                  <wp:cNvGraphicFramePr>
-                    <a:graphicFrameLocks noChangeAspect="1"/>
-                  </wp:cNvGraphicFramePr>
-                  <a:graphic>
-                    <a:graphicData uri="http://schemas.openxmlformats.org/drawingml/2006/picture">
-                      <pic:pic>
-                        <pic:nvPicPr>
-                          <pic:cNvPr id="0" name="task-1.3.png"/>
-                          <pic:cNvPicPr/>
-                        </pic:nvPicPr>
-                        <pic:blipFill>
-                          <a:blip r:embed="rId12"/>
-                          <a:stretch>
-                            <a:fillRect/>
-                          </a:stretch>
-                        </pic:blipFill>
-                        <pic:spPr>
-                          <a:xfrm>
-                            <a:off x="0" y="0"/>
-                            <a:ext cx="917999" cy="917999"/>
-                          </a:xfrm>
-                          <a:prstGeom prst="rect"/>
-                        </pic:spPr>
-                      </pic:pic>
-                    </a:graphicData>
-                  </a:graphic>
-                </wp:inline>
-              </w:drawing>
-            </w:r>
-          </w:p>
-          <w:p>
-            <w:pPr>
-              <w:spacing w:after="0"/>
-              <w:jc w:val="center"/>
-            </w:pPr>
-            <w:r>
-              <w:rPr>
-                <w:rFonts w:ascii="Times New Roman" w:hAnsi="Times New Roman"/>
-                <w:b/>
-                <w:sz w:val="18"/>
-              </w:rPr>
-              <w:t>1.3  Подключение наборов к сценам</w:t>
-            </w:r>
-          </w:p>
-          <w:p>
-            <w:pPr>
-              <w:spacing w:after="0"/>
-              <w:jc w:val="center"/>
-            </w:pPr>
-            <w:r>
-              <w:rPr>
-                <w:rFonts w:ascii="Times New Roman" w:hAnsi="Times New Roman"/>
-                <w:b w:val="0"/>
-                <w:color w:val="5A5A5A"/>
-                <w:sz w:val="15"/>
-              </w:rPr>
-              <w:t>evidence/tasks/1.3.md</w:t>
-            </w:r>
-          </w:p>
-        </w:tc>
-        <w:tc>
-          <w:tcPr>
-            <w:tcW w:type="dxa" w:w="4677"/>
-            <w:vAlign w:val="center"/>
-            <w:tcMar>
-              <w:top w:w="100" w:type="dxa"/>
-              <w:start w:w="90" w:type="dxa"/>
-              <w:bottom w:w="100" w:type="dxa"/>
-              <w:end w:w="90" w:type="dxa"/>
-            </w:tcMar>
-          </w:tcPr>
-          <w:p>
-            <w:pPr>
-              <w:spacing w:after="0"/>
-              <w:jc w:val="center"/>
-            </w:pPr>
-            <w:r>
-              <w:drawing>
-                <wp:inline xmlns:a="http://schemas.openxmlformats.org/drawingml/2006/main" xmlns:pic="http://schemas.openxmlformats.org/drawingml/2006/picture">
-                  <wp:extent cx="917999" cy="917999"/>
-                  <wp:docPr id="7" name="Picture 7"/>
-                  <wp:cNvGraphicFramePr>
-                    <a:graphicFrameLocks noChangeAspect="1"/>
-                  </wp:cNvGraphicFramePr>
-                  <a:graphic>
-                    <a:graphicData uri="http://schemas.openxmlformats.org/drawingml/2006/picture">
-                      <pic:pic>
-                        <pic:nvPicPr>
-                          <pic:cNvPr id="0" name="task-2.1.png"/>
-                          <pic:cNvPicPr/>
-                        </pic:nvPicPr>
-                        <pic:blipFill>
-                          <a:blip r:embed="rId13"/>
-                          <a:stretch>
-                            <a:fillRect/>
-                          </a:stretch>
-                        </pic:blipFill>
-                        <pic:spPr>
-                          <a:xfrm>
-                            <a:off x="0" y="0"/>
-                            <a:ext cx="917999" cy="917999"/>
-                          </a:xfrm>
-                          <a:prstGeom prst="rect"/>
-                        </pic:spPr>
-                      </pic:pic>
-                    </a:graphicData>
-                  </a:graphic>
-                </wp:inline>
-              </w:drawing>
-            </w:r>
-          </w:p>
-          <w:p>
-            <w:pPr>
-              <w:spacing w:after="0"/>
-              <w:jc w:val="center"/>
-            </w:pPr>
-            <w:r>
-              <w:rPr>
-                <w:rFonts w:ascii="Times New Roman" w:hAnsi="Times New Roman"/>
-                <w:b/>
-                <w:sz w:val="18"/>
-              </w:rPr>
-              <w:t>2.1  Параметры аудиодвижка</w:t>
-            </w:r>
-          </w:p>
-          <w:p>
-            <w:pPr>
-              <w:spacing w:after="0"/>
-              <w:jc w:val="center"/>
-            </w:pPr>
-            <w:r>
-              <w:rPr>
-                <w:rFonts w:ascii="Times New Roman" w:hAnsi="Times New Roman"/>
-                <w:b w:val="0"/>
-                <w:color w:val="5A5A5A"/>
-                <w:sz w:val="15"/>
-              </w:rPr>
-              <w:t>evidence/tasks/2.1.md</w:t>
-            </w:r>
-          </w:p>
-        </w:tc>
-      </w:tr>
-      <w:tr>
-        <w:trPr>
-          <w:trHeight w:val="2013" w:hRule="atLeast"/>
-          <w:cantSplit/>
-        </w:trPr>
-        <w:tc>
-          <w:tcPr>
-            <w:tcW w:type="dxa" w:w="4677"/>
-            <w:vAlign w:val="center"/>
-            <w:tcMar>
-              <w:top w:w="100" w:type="dxa"/>
-              <w:start w:w="90" w:type="dxa"/>
-              <w:bottom w:w="100" w:type="dxa"/>
-              <w:end w:w="90" w:type="dxa"/>
-            </w:tcMar>
-          </w:tcPr>
-          <w:p>
-            <w:pPr>
-              <w:spacing w:after="0"/>
-              <w:jc w:val="center"/>
-            </w:pPr>
-            <w:r>
-              <w:drawing>
-                <wp:inline xmlns:a="http://schemas.openxmlformats.org/drawingml/2006/main" xmlns:pic="http://schemas.openxmlformats.org/drawingml/2006/picture">
-                  <wp:extent cx="917999" cy="917999"/>
-                  <wp:docPr id="8" name="Picture 8"/>
-                  <wp:cNvGraphicFramePr>
-                    <a:graphicFrameLocks noChangeAspect="1"/>
-                  </wp:cNvGraphicFramePr>
-                  <a:graphic>
-                    <a:graphicData uri="http://schemas.openxmlformats.org/drawingml/2006/picture">
-                      <pic:pic>
-                        <pic:nvPicPr>
-                          <pic:cNvPr id="0" name="task-2.2.png"/>
-                          <pic:cNvPicPr/>
-                        </pic:nvPicPr>
-                        <pic:blipFill>
-                          <a:blip r:embed="rId14"/>
-                          <a:stretch>
-                            <a:fillRect/>
-                          </a:stretch>
-                        </pic:blipFill>
-                        <pic:spPr>
-                          <a:xfrm>
-                            <a:off x="0" y="0"/>
-                            <a:ext cx="917999" cy="917999"/>
-                          </a:xfrm>
-                          <a:prstGeom prst="rect"/>
-                        </pic:spPr>
-                      </pic:pic>
-                    </a:graphicData>
-                  </a:graphic>
-                </wp:inline>
-              </w:drawing>
-            </w:r>
-          </w:p>
-          <w:p>
-            <w:pPr>
-              <w:spacing w:after="0"/>
-              <w:jc w:val="center"/>
-            </w:pPr>
-            <w:r>
-              <w:rPr>
-                <w:rFonts w:ascii="Times New Roman" w:hAnsi="Times New Roman"/>
-                <w:b/>
-                <w:sz w:val="18"/>
-              </w:rPr>
-              <w:t>2.2  Циклы и плавные переходы</w:t>
-            </w:r>
-          </w:p>
-          <w:p>
-            <w:pPr>
-              <w:spacing w:after="0"/>
-              <w:jc w:val="center"/>
-            </w:pPr>
-            <w:r>
-              <w:rPr>
-                <w:rFonts w:ascii="Times New Roman" w:hAnsi="Times New Roman"/>
-                <w:b w:val="0"/>
-                <w:color w:val="5A5A5A"/>
-                <w:sz w:val="15"/>
-              </w:rPr>
-              <w:t>evidence/tasks/2.2.md</w:t>
-            </w:r>
-          </w:p>
-        </w:tc>
-        <w:tc>
-          <w:tcPr>
-            <w:tcW w:type="dxa" w:w="4677"/>
-            <w:vAlign w:val="center"/>
-            <w:tcMar>
-              <w:top w:w="100" w:type="dxa"/>
-              <w:start w:w="90" w:type="dxa"/>
-              <w:bottom w:w="100" w:type="dxa"/>
-              <w:end w:w="90" w:type="dxa"/>
-            </w:tcMar>
-          </w:tcPr>
-          <w:p>
-            <w:pPr>
-              <w:spacing w:after="0"/>
-              <w:jc w:val="center"/>
-            </w:pPr>
-            <w:r>
-              <w:drawing>
-                <wp:inline xmlns:a="http://schemas.openxmlformats.org/drawingml/2006/main" xmlns:pic="http://schemas.openxmlformats.org/drawingml/2006/picture">
-                  <wp:extent cx="917999" cy="917999"/>
-                  <wp:docPr id="9" name="Picture 9"/>
-                  <wp:cNvGraphicFramePr>
-                    <a:graphicFrameLocks noChangeAspect="1"/>
-                  </wp:cNvGraphicFramePr>
-                  <a:graphic>
-                    <a:graphicData uri="http://schemas.openxmlformats.org/drawingml/2006/picture">
-                      <pic:pic>
-                        <pic:nvPicPr>
-                          <pic:cNvPr id="0" name="task-3.1.png"/>
-                          <pic:cNvPicPr/>
-                        </pic:nvPicPr>
-                        <pic:blipFill>
-                          <a:blip r:embed="rId15"/>
-                          <a:stretch>
-                            <a:fillRect/>
-                          </a:stretch>
-                        </pic:blipFill>
-                        <pic:spPr>
-                          <a:xfrm>
-                            <a:off x="0" y="0"/>
-                            <a:ext cx="917999" cy="917999"/>
-                          </a:xfrm>
-                          <a:prstGeom prst="rect"/>
-                        </pic:spPr>
-                      </pic:pic>
-                    </a:graphicData>
-                  </a:graphic>
-                </wp:inline>
-              </w:drawing>
-            </w:r>
-          </w:p>
-          <w:p>
-            <w:pPr>
-              <w:spacing w:after="0"/>
-              <w:jc w:val="center"/>
-            </w:pPr>
-            <w:r>
-              <w:rPr>
-                <w:rFonts w:ascii="Times New Roman" w:hAnsi="Times New Roman"/>
-                <w:b/>
-                <w:sz w:val="18"/>
-              </w:rPr>
-              <w:t>3.1  Маршрут «Мой микс»</w:t>
-            </w:r>
-          </w:p>
-          <w:p>
-            <w:pPr>
-              <w:spacing w:after="0"/>
-              <w:jc w:val="center"/>
-            </w:pPr>
-            <w:r>
-              <w:rPr>
-                <w:rFonts w:ascii="Times New Roman" w:hAnsi="Times New Roman"/>
-                <w:b w:val="0"/>
-                <w:color w:val="5A5A5A"/>
-                <w:sz w:val="15"/>
-              </w:rPr>
-              <w:t>evidence/tasks/3.1.md</w:t>
-            </w:r>
-          </w:p>
-        </w:tc>
-      </w:tr>
-      <w:tr>
-        <w:trPr>
-          <w:trHeight w:val="2013" w:hRule="atLeast"/>
-          <w:cantSplit/>
-        </w:trPr>
-        <w:tc>
-          <w:tcPr>
-            <w:tcW w:type="dxa" w:w="4677"/>
-            <w:vAlign w:val="center"/>
-            <w:tcMar>
-              <w:top w:w="100" w:type="dxa"/>
-              <w:start w:w="90" w:type="dxa"/>
-              <w:bottom w:w="100" w:type="dxa"/>
-              <w:end w:w="90" w:type="dxa"/>
-            </w:tcMar>
-          </w:tcPr>
-          <w:p>
-            <w:pPr>
-              <w:spacing w:after="0"/>
-              <w:jc w:val="center"/>
-            </w:pPr>
-            <w:r>
-              <w:drawing>
-                <wp:inline xmlns:a="http://schemas.openxmlformats.org/drawingml/2006/main" xmlns:pic="http://schemas.openxmlformats.org/drawingml/2006/picture">
-                  <wp:extent cx="917999" cy="917999"/>
-                  <wp:docPr id="10" name="Picture 10"/>
-                  <wp:cNvGraphicFramePr>
-                    <a:graphicFrameLocks noChangeAspect="1"/>
-                  </wp:cNvGraphicFramePr>
-                  <a:graphic>
-                    <a:graphicData uri="http://schemas.openxmlformats.org/drawingml/2006/picture">
-                      <pic:pic>
-                        <pic:nvPicPr>
-                          <pic:cNvPr id="0" name="task-3.2.png"/>
-                          <pic:cNvPicPr/>
-                        </pic:nvPicPr>
-                        <pic:blipFill>
-                          <a:blip r:embed="rId16"/>
-                          <a:stretch>
-                            <a:fillRect/>
-                          </a:stretch>
-                        </pic:blipFill>
-                        <pic:spPr>
-                          <a:xfrm>
-                            <a:off x="0" y="0"/>
-                            <a:ext cx="917999" cy="917999"/>
-                          </a:xfrm>
-                          <a:prstGeom prst="rect"/>
-                        </pic:spPr>
-                      </pic:pic>
-                    </a:graphicData>
-                  </a:graphic>
-                </wp:inline>
-              </w:drawing>
-            </w:r>
-          </w:p>
-          <w:p>
-            <w:pPr>
-              <w:spacing w:after="0"/>
-              <w:jc w:val="center"/>
-            </w:pPr>
-            <w:r>
-              <w:rPr>
-                <w:rFonts w:ascii="Times New Roman" w:hAnsi="Times New Roman"/>
-                <w:b/>
-                <w:sz w:val="18"/>
-              </w:rPr>
-              <w:t>3.2  Применение пользовательского микса</w:t>
-            </w:r>
-          </w:p>
-          <w:p>
-            <w:pPr>
-              <w:spacing w:after="0"/>
-              <w:jc w:val="center"/>
-            </w:pPr>
-            <w:r>
-              <w:rPr>
-                <w:rFonts w:ascii="Times New Roman" w:hAnsi="Times New Roman"/>
-                <w:b w:val="0"/>
-                <w:color w:val="5A5A5A"/>
-                <w:sz w:val="15"/>
-              </w:rPr>
-              <w:t>evidence/tasks/3.2.md</w:t>
-            </w:r>
-          </w:p>
-        </w:tc>
-        <w:tc>
-          <w:tcPr>
-            <w:tcW w:type="dxa" w:w="4677"/>
-            <w:vAlign w:val="center"/>
-            <w:tcMar>
-              <w:top w:w="100" w:type="dxa"/>
-              <w:start w:w="90" w:type="dxa"/>
-              <w:bottom w:w="100" w:type="dxa"/>
-              <w:end w:w="90" w:type="dxa"/>
-            </w:tcMar>
-          </w:tcPr>
-          <w:p>
-            <w:pPr>
-              <w:spacing w:after="0"/>
-              <w:jc w:val="center"/>
-            </w:pPr>
-            <w:r>
-              <w:drawing>
-                <wp:inline xmlns:a="http://schemas.openxmlformats.org/drawingml/2006/main" xmlns:pic="http://schemas.openxmlformats.org/drawingml/2006/picture">
-                  <wp:extent cx="917999" cy="917999"/>
-                  <wp:docPr id="11" name="Picture 11"/>
-                  <wp:cNvGraphicFramePr>
-                    <a:graphicFrameLocks noChangeAspect="1"/>
-                  </wp:cNvGraphicFramePr>
-                  <a:graphic>
-                    <a:graphicData uri="http://schemas.openxmlformats.org/drawingml/2006/picture">
-                      <pic:pic>
-                        <pic:nvPicPr>
-                          <pic:cNvPr id="0" name="task-3.3.png"/>
-                          <pic:cNvPicPr/>
-                        </pic:nvPicPr>
-                        <pic:blipFill>
-                          <a:blip r:embed="rId17"/>
-                          <a:stretch>
-                            <a:fillRect/>
-                          </a:stretch>
-                        </pic:blipFill>
-                        <pic:spPr>
-                          <a:xfrm>
-                            <a:off x="0" y="0"/>
-                            <a:ext cx="917999" cy="917999"/>
-                          </a:xfrm>
-                          <a:prstGeom prst="rect"/>
-                        </pic:spPr>
-                      </pic:pic>
-                    </a:graphicData>
-                  </a:graphic>
-                </wp:inline>
-              </w:drawing>
-            </w:r>
-          </w:p>
-          <w:p>
-            <w:pPr>
-              <w:spacing w:after="0"/>
-              <w:jc w:val="center"/>
-            </w:pPr>
-            <w:r>
-              <w:rPr>
-                <w:rFonts w:ascii="Times New Roman" w:hAnsi="Times New Roman"/>
-                <w:b/>
-                <w:sz w:val="18"/>
-              </w:rPr>
-              <w:t>3.3  Предпрослушивание и сохранение</w:t>
-            </w:r>
-          </w:p>
-          <w:p>
-            <w:pPr>
-              <w:spacing w:after="0"/>
-              <w:jc w:val="center"/>
-            </w:pPr>
-            <w:r>
-              <w:rPr>
-                <w:rFonts w:ascii="Times New Roman" w:hAnsi="Times New Roman"/>
-                <w:b w:val="0"/>
-                <w:color w:val="5A5A5A"/>
-                <w:sz w:val="15"/>
-              </w:rPr>
-              <w:t>evidence/tasks/3.3.md</w:t>
-            </w:r>
-          </w:p>
-        </w:tc>
-      </w:tr>
-      <w:tr>
-        <w:trPr>
-          <w:trHeight w:val="2013" w:hRule="atLeast"/>
-          <w:cantSplit/>
-        </w:trPr>
-        <w:tc>
-          <w:tcPr>
-            <w:tcW w:type="dxa" w:w="4677"/>
-            <w:vAlign w:val="center"/>
-            <w:tcMar>
-              <w:top w:w="100" w:type="dxa"/>
-              <w:start w:w="90" w:type="dxa"/>
-              <w:bottom w:w="100" w:type="dxa"/>
-              <w:end w:w="90" w:type="dxa"/>
-            </w:tcMar>
-          </w:tcPr>
-          <w:p>
-            <w:pPr>
-              <w:spacing w:after="0"/>
-              <w:jc w:val="center"/>
-            </w:pPr>
-            <w:r>
-              <w:drawing>
-                <wp:inline xmlns:a="http://schemas.openxmlformats.org/drawingml/2006/main" xmlns:pic="http://schemas.openxmlformats.org/drawingml/2006/picture">
-                  <wp:extent cx="917999" cy="917999"/>
-                  <wp:docPr id="12" name="Picture 12"/>
-                  <wp:cNvGraphicFramePr>
-                    <a:graphicFrameLocks noChangeAspect="1"/>
-                  </wp:cNvGraphicFramePr>
-                  <a:graphic>
-                    <a:graphicData uri="http://schemas.openxmlformats.org/drawingml/2006/picture">
-                      <pic:pic>
-                        <pic:nvPicPr>
-                          <pic:cNvPr id="0" name="task-4.1.png"/>
-                          <pic:cNvPicPr/>
-                        </pic:nvPicPr>
-                        <pic:blipFill>
-                          <a:blip r:embed="rId18"/>
-                          <a:stretch>
-                            <a:fillRect/>
-                          </a:stretch>
-                        </pic:blipFill>
-                        <pic:spPr>
-                          <a:xfrm>
-                            <a:off x="0" y="0"/>
-                            <a:ext cx="917999" cy="917999"/>
-                          </a:xfrm>
-                          <a:prstGeom prst="rect"/>
-                        </pic:spPr>
-                      </pic:pic>
-                    </a:graphicData>
-                  </a:graphic>
-                </wp:inline>
-              </w:drawing>
-            </w:r>
-          </w:p>
-          <w:p>
-            <w:pPr>
-              <w:spacing w:after="0"/>
-              <w:jc w:val="center"/>
-            </w:pPr>
-            <w:r>
-              <w:rPr>
-                <w:rFonts w:ascii="Times New Roman" w:hAnsi="Times New Roman"/>
-                <w:b/>
-                <w:sz w:val="18"/>
-              </w:rPr>
-              <w:t>4.1  Каталог «Сценариев»</w:t>
-            </w:r>
-          </w:p>
-          <w:p>
-            <w:pPr>
-              <w:spacing w:after="0"/>
-              <w:jc w:val="center"/>
-            </w:pPr>
-            <w:r>
-              <w:rPr>
-                <w:rFonts w:ascii="Times New Roman" w:hAnsi="Times New Roman"/>
-                <w:b w:val="0"/>
-                <w:color w:val="5A5A5A"/>
-                <w:sz w:val="15"/>
-              </w:rPr>
-              <w:t>evidence/tasks/4.1.md</w:t>
-            </w:r>
-          </w:p>
-        </w:tc>
-        <w:tc>
-          <w:tcPr>
-            <w:tcW w:type="dxa" w:w="4677"/>
-            <w:vAlign w:val="center"/>
-            <w:tcMar>
-              <w:top w:w="100" w:type="dxa"/>
-              <w:start w:w="90" w:type="dxa"/>
-              <w:bottom w:w="100" w:type="dxa"/>
-              <w:end w:w="90" w:type="dxa"/>
-            </w:tcMar>
-          </w:tcPr>
-          <w:p>
-            <w:pPr>
-              <w:spacing w:after="0"/>
-              <w:jc w:val="center"/>
-            </w:pPr>
-            <w:r>
-              <w:drawing>
-                <wp:inline xmlns:a="http://schemas.openxmlformats.org/drawingml/2006/main" xmlns:pic="http://schemas.openxmlformats.org/drawingml/2006/picture">
-                  <wp:extent cx="917999" cy="917999"/>
-                  <wp:docPr id="13" name="Picture 13"/>
-                  <wp:cNvGraphicFramePr>
-                    <a:graphicFrameLocks noChangeAspect="1"/>
-                  </wp:cNvGraphicFramePr>
-                  <a:graphic>
-                    <a:graphicData uri="http://schemas.openxmlformats.org/drawingml/2006/picture">
-                      <pic:pic>
-                        <pic:nvPicPr>
-                          <pic:cNvPr id="0" name="task-4.2.png"/>
-                          <pic:cNvPicPr/>
-                        </pic:nvPicPr>
-                        <pic:blipFill>
-                          <a:blip r:embed="rId19"/>
-                          <a:stretch>
-                            <a:fillRect/>
-                          </a:stretch>
-                        </pic:blipFill>
-                        <pic:spPr>
-                          <a:xfrm>
-                            <a:off x="0" y="0"/>
-                            <a:ext cx="917999" cy="917999"/>
-                          </a:xfrm>
-                          <a:prstGeom prst="rect"/>
-                        </pic:spPr>
-                      </pic:pic>
-                    </a:graphicData>
-                  </a:graphic>
-                </wp:inline>
-              </w:drawing>
-            </w:r>
-          </w:p>
-          <w:p>
-            <w:pPr>
-              <w:spacing w:after="0"/>
-              <w:jc w:val="center"/>
-            </w:pPr>
-            <w:r>
-              <w:rPr>
-                <w:rFonts w:ascii="Times New Roman" w:hAnsi="Times New Roman"/>
-                <w:b/>
-                <w:sz w:val="18"/>
-              </w:rPr>
-              <w:t>4.2  Этапы и переходы сценария</w:t>
-            </w:r>
-          </w:p>
-          <w:p>
-            <w:pPr>
-              <w:spacing w:after="0"/>
-              <w:jc w:val="center"/>
-            </w:pPr>
-            <w:r>
-              <w:rPr>
-                <w:rFonts w:ascii="Times New Roman" w:hAnsi="Times New Roman"/>
-                <w:b w:val="0"/>
-                <w:color w:val="5A5A5A"/>
-                <w:sz w:val="15"/>
-              </w:rPr>
-              <w:t>evidence/tasks/4.2.md</w:t>
-            </w:r>
-          </w:p>
-        </w:tc>
-      </w:tr>
-    </w:tbl>
     <w:sectPr>
       <w:pgSz w:w="11906" w:h="16838"/>
       <w:pgMar w:top="1134" w:right="850" w:bottom="1134" w:left="1701" w:header="708" w:footer="708" w:gutter="0"/>

</xml_diff>

<commit_message>
Remove audio authorship statements from practice materials
</commit_message>
<xml_diff>
--- a/docs/report.docx
+++ b/docs/report.docx
@@ -1383,22 +1383,6 @@
           <w:sz w:val="24"/>
         </w:rPr>
         <w:t>Соответствие состояний, сетов и ролей задаётся в lib/shared/audio/soundscape_config.dart. Конфигурация содержит путь к файлу каждой роли и параметры длительности цикла. Для состояния «Стресс» третий сет подключён к конфигурации и содержит четыре согласованных FLAC-файла: drone, pad, texture и pulse. Все четыре файла имеют по 14 628 572 кадра, что соответствует 304,761917 секунды при 48 кГц.</w:t>
-      </w:r>
-    </w:p>
-    <w:p>
-      <w:pPr>
-        <w:pStyle w:val="11"/>
-        <w:keepLines/>
-        <w:spacing w:after="100" w:line="269" w:lineRule="auto"/>
-        <w:jc w:val="left"/>
-      </w:pPr>
-      <w:r>
-        <w:rPr>
-          <w:rFonts w:ascii="Times New Roman" w:hAnsi="Times New Roman"/>
-          <w:b w:val="0"/>
-          <w:sz w:val="24"/>
-        </w:rPr>
-        <w:t>Автор практики подтверждает, что все аудиоматериалы MindFlow принадлежат ему. Уникальные варианты звуковых сцен подготовлены из его аудиослоёв для генеративной сборки и микширования.</w:t>
       </w:r>
     </w:p>
     <w:tbl>

</xml_diff>